<commit_message>
Cập nhật cấu trúc cho mọi người tiếp tục và hoàn chỉnh để mọi người push đúng nhánh chức năng của mình đúng nhiệm vụ đc giao
</commit_message>
<xml_diff>
--- a/TAI_LIEU_DU_AN_FASHION_SHOP.docx
+++ b/TAI_LIEU_DU_AN_FASHION_SHOP.docx
@@ -4,26 +4,11 @@
   <w:body>
     <w:p>
       <w:pPr>
+        <w:pStyle w:val="Title"/>
         <w:jc w:val="center"/>
       </w:pPr>
       <w:r>
-        <w:rPr>
-          <w:b/>
-          <w:sz w:val="40"/>
-        </w:rPr>
-        <w:t>T?I LI?U D? ?N FASHION SHOP</w:t>
-      </w:r>
-    </w:p>
-    <w:p>
-      <w:pPr>
-        <w:jc w:val="center"/>
-      </w:pPr>
-      <w:r>
-        <w:rPr>
-          <w:i/>
-          <w:sz w:val="26"/>
-        </w:rPr>
-        <w:t>Studio &amp; Atelier</w:t>
+        <w:t>TÀI LIỆU DỰ ÁN FASHIONSHOP</w:t>
       </w:r>
     </w:p>
     <w:p>
@@ -34,7 +19,9 @@
         <w:rPr>
           <w:i/>
         </w:rPr>
-        <w:t>T?i li?u ???c c?p nh?t theo m? ngu?n hi?n t?i</w:t>
+        <w:t>Studio &amp; Atelier</w:t>
+        <w:br/>
+        <w:t>Tài liệu được cập nhật theo mã nguồn hiện tại</w:t>
       </w:r>
     </w:p>
     <w:p>
@@ -42,12 +29,12 @@
         <w:pStyle w:val="Heading1"/>
       </w:pPr>
       <w:r>
-        <w:t>1. T?ng quan</w:t>
+        <w:t>1. Tổng quan</w:t>
       </w:r>
     </w:p>
     <w:p>
       <w:r>
-        <w:t>FashionShop l? website th??ng m?i ?i?n t? th?i trang x?y d?ng theo m? h?nh Spring Boot MVC. ?ng d?ng g?m storefront cho kh?ch h?ng, khu v?c qu?n tr?, x?c th?c t?i kho?n, qu?n l? s?n ph?m v? bi?n th?, t?m ki?m, chatbot t? v?n, coupon, t?n kho, gi? h?ng, y?u th?ch v? ??n h?ng. M?t s? m?n h?nh qu?n tr? v? storefront v?n l? khung giao di?n ?? ti?p t?c ph?t tri?n nghi?p v?.</w:t>
+        <w:t>FashionShop là website thương mại điện tử thời trang xây dựng bằng Spring Boot MVC. Hệ thống gồm storefront cho khách hàng, khu vực quản trị, xác thực tài khoản, sản phẩm và biến thể, tìm kiếm, chatbot, coupon, tồn kho, giỏ hàng, yêu thích và đơn hàng. Một số màn hình nghiệp vụ vẫn là khung giao diện để tiếp tục phát triển.</w:t>
       </w:r>
     </w:p>
     <w:p>
@@ -55,7 +42,7 @@
         <w:pStyle w:val="ListBullet"/>
       </w:pPr>
       <w:r>
-        <w:t>Storefront: trang ch?, danh s?ch s?n ph?m, chi ti?t s?n ph?m, sale, t?i kho?n v? l?ch s? ??n h?ng.</w:t>
+        <w:t>Storefront: trang chủ, danh sách/chi tiết sản phẩm, sale, tài khoản và lịch sử đơn hàng.</w:t>
       </w:r>
     </w:p>
     <w:p>
@@ -63,7 +50,7 @@
         <w:pStyle w:val="ListBullet"/>
       </w:pPr>
       <w:r>
-        <w:t>Qu?n tr?: dashboard, danh m?c, s?n ph?m, t?n kho, ??n h?ng, coupon, ng??i d?ng, th?ng k? v? thi?t l?p.</w:t>
+        <w:t>Quản trị: dashboard, danh mục, sản phẩm, tồn kho, đơn hàng, coupon, người dùng, thống kê, tài khoản đăng nhập admin (/admin/account) và thiết lập.</w:t>
       </w:r>
     </w:p>
     <w:p>
@@ -71,7 +58,7 @@
         <w:pStyle w:val="ListBullet"/>
       </w:pPr>
       <w:r>
-        <w:t>T?m ki?m: t?m theo t?n, kh?ng d?u ti?ng Vi?t v? t?m ki?m ng? ngh?a b?ng vector khi c?n.</w:t>
+        <w:t>Xác thực &amp; Bảo mật: đăng nhập linh hoạt bằng Email hoặc Số điện thoại, đăng ký xác thực qua mã OTP 6 số gửi bằng Email (Gmail SMTP), tự động phát hiện và cảnh báo mất kết nối CSDL tại trang đăng nhập.</w:t>
       </w:r>
     </w:p>
     <w:p>
@@ -79,7 +66,7 @@
         <w:pStyle w:val="ListBullet"/>
       </w:pPr>
       <w:r>
-        <w:t>Tr? l? mua s?m: chatbot tr? l?i c?u h?i v? s?n ph?m, gi?, khuy?n m?i, coupon, m?u, size v? t?n kho.</w:t>
+        <w:t>Tìm kiếm: khớp tên, tìm không dấu và tìm ngữ nghĩa bằng vector khi cần.</w:t>
       </w:r>
     </w:p>
     <w:p>
@@ -87,46 +74,49 @@
         <w:pStyle w:val="Heading1"/>
       </w:pPr>
       <w:r>
-        <w:t>2. C?ng ngh? s? d?ng</w:t>
+        <w:t>2. Công nghệ</w:t>
       </w:r>
     </w:p>
     <w:tbl>
       <w:tblPr>
         <w:tblStyle w:val="TableGrid"/>
         <w:tblW w:type="auto" w:w="0"/>
-        <w:jc w:val="center"/>
         <w:tblLook w:firstColumn="1" w:firstRow="1" w:lastColumn="0" w:lastRow="0" w:noHBand="0" w:noVBand="1" w:val="04A0"/>
       </w:tblPr>
       <w:tblGrid>
-        <w:gridCol w:w="4968"/>
-        <w:gridCol w:w="4968"/>
+        <w:gridCol w:w="5040"/>
+        <w:gridCol w:w="5040"/>
       </w:tblGrid>
       <w:tr>
         <w:tc>
           <w:tcPr>
-            <w:tcW w:type="dxa" w:w="4968"/>
-            <w:shd w:fill="D9EAF7"/>
+            <w:tcW w:type="dxa" w:w="5040"/>
+            <w:shd w:fill="E5E7EB"/>
           </w:tcPr>
           <w:p>
             <w:r>
               <w:rPr>
+                <w:rFonts w:ascii="Arial" w:hAnsi="Arial" w:eastAsia="Arial"/>
                 <w:b/>
+                <w:sz w:val="19"/>
               </w:rPr>
-              <w:t>Th?nh ph?n</w:t>
+              <w:t>Thành phần</w:t>
             </w:r>
           </w:p>
         </w:tc>
         <w:tc>
           <w:tcPr>
-            <w:tcW w:type="dxa" w:w="4968"/>
-            <w:shd w:fill="D9EAF7"/>
+            <w:tcW w:type="dxa" w:w="5040"/>
+            <w:shd w:fill="E5E7EB"/>
           </w:tcPr>
           <w:p>
             <w:r>
               <w:rPr>
+                <w:rFonts w:ascii="Arial" w:hAnsi="Arial" w:eastAsia="Arial"/>
                 <w:b/>
+                <w:sz w:val="19"/>
               </w:rPr>
-              <w:t>C?u h?nh</w:t>
+              <w:t>Công nghệ</w:t>
             </w:r>
           </w:p>
         </w:tc>
@@ -134,22 +124,28 @@
       <w:tr>
         <w:tc>
           <w:tcPr>
-            <w:tcW w:type="dxa" w:w="4968"/>
-            <w:vAlign w:val="center"/>
+            <w:tcW w:type="dxa" w:w="5040"/>
           </w:tcPr>
           <w:p>
             <w:r>
-              <w:t>Ng?n ng?</w:t>
+              <w:rPr>
+                <w:rFonts w:ascii="Arial" w:hAnsi="Arial" w:eastAsia="Arial"/>
+                <w:sz w:val="19"/>
+              </w:rPr>
+              <w:t>Ngôn ngữ</w:t>
             </w:r>
           </w:p>
         </w:tc>
         <w:tc>
           <w:tcPr>
-            <w:tcW w:type="dxa" w:w="4968"/>
-            <w:vAlign w:val="center"/>
+            <w:tcW w:type="dxa" w:w="5040"/>
           </w:tcPr>
           <w:p>
             <w:r>
+              <w:rPr>
+                <w:rFonts w:ascii="Arial" w:hAnsi="Arial" w:eastAsia="Arial"/>
+                <w:sz w:val="19"/>
+              </w:rPr>
               <w:t>Java 21</w:t>
             </w:r>
           </w:p>
@@ -158,23 +154,25 @@
       <w:tr>
         <w:tc>
           <w:tcPr>
-            <w:tcW w:type="dxa" w:w="4968"/>
-            <w:vAlign w:val="center"/>
+            <w:tcW w:type="dxa" w:w="5040"/>
           </w:tcPr>
           <w:p>
             <w:r>
+              <w:rPr>
+                <w:rFonts w:ascii="Arial" w:hAnsi="Arial" w:eastAsia="Arial"/>
+                <w:sz w:val="19"/>
+              </w:rPr>
               <w:t>Backend</w:t>
             </w:r>
           </w:p>
         </w:tc>
         <w:tc>
           <w:tcPr>
-            <w:tcW w:type="dxa" w:w="4968"/>
-            <w:vAlign w:val="center"/>
+            <w:tcW w:type="dxa" w:w="5040"/>
           </w:tcPr>
           <w:p>
             <w:r>
-              <w:t>Spring Boot 4.1.1, Spring MVC, Spring Data JPA, Spring Validation</w:t>
+              <w:t>Spring Boot 4.1.1, Spring MVC, Spring Data JPA, Spring Validation, Spring Mail</w:t>
             </w:r>
           </w:p>
         </w:tc>
@@ -182,23 +180,29 @@
       <w:tr>
         <w:tc>
           <w:tcPr>
-            <w:tcW w:type="dxa" w:w="4968"/>
-            <w:vAlign w:val="center"/>
+            <w:tcW w:type="dxa" w:w="5040"/>
           </w:tcPr>
           <w:p>
             <w:r>
-              <w:t>B?o m?t</w:t>
+              <w:rPr>
+                <w:rFonts w:ascii="Arial" w:hAnsi="Arial" w:eastAsia="Arial"/>
+                <w:sz w:val="19"/>
+              </w:rPr>
+              <w:t>Bảo mật</w:t>
             </w:r>
           </w:p>
         </w:tc>
         <w:tc>
           <w:tcPr>
-            <w:tcW w:type="dxa" w:w="4968"/>
-            <w:vAlign w:val="center"/>
+            <w:tcW w:type="dxa" w:w="5040"/>
           </w:tcPr>
           <w:p>
             <w:r>
-              <w:t>Spring Security, BCrypt, ROLE_ADMIN v? ROLE_CUSTOMER</w:t>
+              <w:rPr>
+                <w:rFonts w:ascii="Arial" w:hAnsi="Arial" w:eastAsia="Arial"/>
+                <w:sz w:val="19"/>
+              </w:rPr>
+              <w:t>Spring Security, BCrypt, ROLE_ADMIN/ROLE_CUSTOMER</w:t>
             </w:r>
           </w:p>
         </w:tc>
@@ -206,23 +210,29 @@
       <w:tr>
         <w:tc>
           <w:tcPr>
-            <w:tcW w:type="dxa" w:w="4968"/>
-            <w:vAlign w:val="center"/>
+            <w:tcW w:type="dxa" w:w="5040"/>
           </w:tcPr>
           <w:p>
             <w:r>
-              <w:t>Giao di?n</w:t>
+              <w:rPr>
+                <w:rFonts w:ascii="Arial" w:hAnsi="Arial" w:eastAsia="Arial"/>
+                <w:sz w:val="19"/>
+              </w:rPr>
+              <w:t>Giao diện</w:t>
             </w:r>
           </w:p>
         </w:tc>
         <w:tc>
           <w:tcPr>
-            <w:tcW w:type="dxa" w:w="4968"/>
-            <w:vAlign w:val="center"/>
+            <w:tcW w:type="dxa" w:w="5040"/>
           </w:tcPr>
           <w:p>
             <w:r>
-              <w:t>Thymeleaf, Bootstrap 5.3.3, Bootstrap Icons 1.11.3, CSS t?y bi?n</w:t>
+              <w:rPr>
+                <w:rFonts w:ascii="Arial" w:hAnsi="Arial" w:eastAsia="Arial"/>
+                <w:sz w:val="19"/>
+              </w:rPr>
+              <w:t>Thymeleaf, Bootstrap 5.3.3, Bootstrap Icons</w:t>
             </w:r>
           </w:p>
         </w:tc>
@@ -230,23 +240,29 @@
       <w:tr>
         <w:tc>
           <w:tcPr>
-            <w:tcW w:type="dxa" w:w="4968"/>
-            <w:vAlign w:val="center"/>
+            <w:tcW w:type="dxa" w:w="5040"/>
           </w:tcPr>
           <w:p>
             <w:r>
-              <w:t>C? s? d? li?u</w:t>
+              <w:rPr>
+                <w:rFonts w:ascii="Arial" w:hAnsi="Arial" w:eastAsia="Arial"/>
+                <w:sz w:val="19"/>
+              </w:rPr>
+              <w:t>Cơ sở dữ liệu</w:t>
             </w:r>
           </w:p>
         </w:tc>
         <w:tc>
           <w:tcPr>
-            <w:tcW w:type="dxa" w:w="4968"/>
-            <w:vAlign w:val="center"/>
+            <w:tcW w:type="dxa" w:w="5040"/>
           </w:tcPr>
           <w:p>
             <w:r>
-              <w:t>MariaDB/MySQL, database fashionshop, m? h?a utf8mb4</w:t>
+              <w:rPr>
+                <w:rFonts w:ascii="Arial" w:hAnsi="Arial" w:eastAsia="Arial"/>
+                <w:sz w:val="19"/>
+              </w:rPr>
+              <w:t>MariaDB/MySQL, database fashionshop, utf8mb4</w:t>
             </w:r>
           </w:p>
         </w:tc>
@@ -254,23 +270,29 @@
       <w:tr>
         <w:tc>
           <w:tcPr>
-            <w:tcW w:type="dxa" w:w="4968"/>
-            <w:vAlign w:val="center"/>
+            <w:tcW w:type="dxa" w:w="5040"/>
           </w:tcPr>
           <w:p>
             <w:r>
-              <w:t>T?m ki?m vector</w:t>
+              <w:rPr>
+                <w:rFonts w:ascii="Arial" w:hAnsi="Arial" w:eastAsia="Arial"/>
+                <w:sz w:val="19"/>
+              </w:rPr>
+              <w:t>Vector và AI cục bộ</w:t>
             </w:r>
           </w:p>
         </w:tc>
         <w:tc>
           <w:tcPr>
-            <w:tcW w:type="dxa" w:w="4968"/>
-            <w:vAlign w:val="center"/>
+            <w:tcW w:type="dxa" w:w="5040"/>
           </w:tcPr>
           <w:p>
             <w:r>
-              <w:t>MariaDB Vector v? Ollama bge-m3</w:t>
+              <w:rPr>
+                <w:rFonts w:ascii="Arial" w:hAnsi="Arial" w:eastAsia="Arial"/>
+                <w:sz w:val="19"/>
+              </w:rPr>
+              <w:t>MariaDB Vector, Ollama bge-m3, qwen2.5:3b</w:t>
             </w:r>
           </w:p>
         </w:tc>
@@ -278,22 +300,28 @@
       <w:tr>
         <w:tc>
           <w:tcPr>
-            <w:tcW w:type="dxa" w:w="4968"/>
-            <w:vAlign w:val="center"/>
+            <w:tcW w:type="dxa" w:w="5040"/>
           </w:tcPr>
           <w:p>
             <w:r>
+              <w:rPr>
+                <w:rFonts w:ascii="Arial" w:hAnsi="Arial" w:eastAsia="Arial"/>
+                <w:sz w:val="19"/>
+              </w:rPr>
               <w:t>Build</w:t>
             </w:r>
           </w:p>
         </w:tc>
         <w:tc>
           <w:tcPr>
-            <w:tcW w:type="dxa" w:w="4968"/>
-            <w:vAlign w:val="center"/>
+            <w:tcW w:type="dxa" w:w="5040"/>
           </w:tcPr>
           <w:p>
             <w:r>
+              <w:rPr>
+                <w:rFonts w:ascii="Arial" w:hAnsi="Arial" w:eastAsia="Arial"/>
+                <w:sz w:val="19"/>
+              </w:rPr>
               <w:t>Gradle Wrapper</w:t>
             </w:r>
           </w:p>
@@ -306,81 +334,159 @@
         <w:pStyle w:val="Heading1"/>
       </w:pPr>
       <w:r>
-        <w:t>3. T?i kho?n ki?m th?</w:t>
+        <w:t>3. Chatbot tư vấn sản phẩm</w:t>
       </w:r>
     </w:p>
     <w:p>
       <w:r>
-        <w:t>C?c t?i kho?n b?n d??i ???c n?p t? database/fashionshop.sql v?i m?t kh?u l?u d??i d?ng BCrypt. Kh?ng s? d?ng c?c m?t kh?u n?y l?m th?ng tin c?u h?nh tri?n khai th?c t?.</w:t>
+        <w:t>Chatbot nằm trong fragments/chatbox.html và được nạp qua layouts/user-base.html. Tin nhắn được chuẩn hóa tại ChatbotController, giới hạn tối đa 500 ký tự và hỗ trợ trả lời thường hoặc streaming.</w:t>
+      </w:r>
+    </w:p>
+    <w:p>
+      <w:pPr>
+        <w:pStyle w:val="Heading2"/>
+      </w:pPr>
+      <w:r>
+        <w:t>3.1. Kiến trúc hai tầng</w:t>
+      </w:r>
+    </w:p>
+    <w:p>
+      <w:pPr>
+        <w:pStyle w:val="ListBullet"/>
+      </w:pPr>
+      <w:r>
+        <w:t>Tầng 1 - Rule-based và database: xử lý coupon, giá, sản phẩm sale, danh mục, size, màu, tồn kho và chính sách. Kết quả lấy trực tiếp từ dữ liệu ứng dụng, không qua LLM.</w:t>
+      </w:r>
+    </w:p>
+    <w:p>
+      <w:pPr>
+        <w:pStyle w:val="ListBullet"/>
+      </w:pPr>
+      <w:r>
+        <w:t>Tầng 2 - RAG và LLM (Ollama / Google Gemini): với câu hỏi mở hoặc yêu cầu tư vấn phong cách, hệ thống tìm sản phẩm tương đồng qua MariaDB Vector (mô hình embedding bge-m3), sau đó gửi ngữ cảnh sản phẩm thực cho mô hình chat (qwen2.5:3b qua Ollama hoặc Google Gemini qua API). Mỗi thành viên tự tạo API key riêng tại Google AI Studio (không dùng chung key), chọn model có Free Tier. Hệ thống tích hợp sẵn cache 600 giây, cooldown 60 giây khi chạm hạn ngạch 429 và tự động chuyển sang danh sách gợi ý sản phẩm nếu AI gặp lỗi.</w:t>
+      </w:r>
+    </w:p>
+    <w:p>
+      <w:pPr>
+        <w:pStyle w:val="ListBullet"/>
+      </w:pPr>
+      <w:r>
+        <w:t>Prompt yêu cầu chỉ tư vấn dựa trên dữ liệu cửa hàng, không bịa tên sản phẩm, giá, mã giảm giá hoặc tồn kho; khi Ollama lỗi sẽ dùng fallback hoặc thông báo phù hợp.</w:t>
+      </w:r>
+    </w:p>
+    <w:p>
+      <w:pPr>
+        <w:pStyle w:val="Heading2"/>
+      </w:pPr>
+      <w:r>
+        <w:t>3.2. Chức năng chính</w:t>
+      </w:r>
+    </w:p>
+    <w:p>
+      <w:pPr>
+        <w:pStyle w:val="ListBullet"/>
+      </w:pPr>
+      <w:r>
+        <w:t>Tra cứu coupon đang hoạt động và hướng dẫn nhập mã tại Checkout.</w:t>
+      </w:r>
+    </w:p>
+    <w:p>
+      <w:pPr>
+        <w:pStyle w:val="ListBullet"/>
+      </w:pPr>
+      <w:r>
+        <w:t>Lọc sản phẩm theo giá, danh mục và bổ sung mẫu có giá gần nhất khi danh sách phù hợp ít hơn 5 sản phẩm.</w:t>
+      </w:r>
+    </w:p>
+    <w:p>
+      <w:pPr>
+        <w:pStyle w:val="ListBullet"/>
+      </w:pPr>
+      <w:r>
+        <w:t>Liệt kê sale theo danh mục hoặc top sản phẩm sale toàn cửa hàng.</w:t>
+      </w:r>
+    </w:p>
+    <w:p>
+      <w:pPr>
+        <w:pStyle w:val="ListBullet"/>
+      </w:pPr>
+      <w:r>
+        <w:t>Tra cứu size, màu, tồn kho theo sản phẩm hoặc theo size chung.</w:t>
+      </w:r>
+    </w:p>
+    <w:p>
+      <w:pPr>
+        <w:pStyle w:val="ListBullet"/>
+      </w:pPr>
+      <w:r>
+        <w:t>Trả lời chính sách vận chuyển, đổi trả, địa chỉ và hotline.</w:t>
+      </w:r>
+    </w:p>
+    <w:p>
+      <w:pPr>
+        <w:pStyle w:val="ListBullet"/>
+      </w:pPr>
+      <w:r>
+        <w:t>Tư vấn phong cách/phối đồ dựa trên các sản phẩm thực có trong kho.</w:t>
       </w:r>
     </w:p>
     <w:tbl>
       <w:tblPr>
         <w:tblStyle w:val="TableGrid"/>
         <w:tblW w:type="auto" w:w="0"/>
-        <w:jc w:val="center"/>
         <w:tblLook w:firstColumn="1" w:firstRow="1" w:lastColumn="0" w:lastRow="0" w:noHBand="0" w:noVBand="1" w:val="04A0"/>
       </w:tblPr>
       <w:tblGrid>
-        <w:gridCol w:w="2484"/>
-        <w:gridCol w:w="2484"/>
-        <w:gridCol w:w="2484"/>
-        <w:gridCol w:w="2484"/>
+        <w:gridCol w:w="3360"/>
+        <w:gridCol w:w="3360"/>
+        <w:gridCol w:w="3360"/>
       </w:tblGrid>
       <w:tr>
         <w:tc>
           <w:tcPr>
-            <w:tcW w:type="dxa" w:w="2484"/>
-            <w:shd w:fill="D9EAF7"/>
+            <w:tcW w:type="dxa" w:w="3360"/>
+            <w:shd w:fill="E5E7EB"/>
           </w:tcPr>
           <w:p>
             <w:r>
               <w:rPr>
+                <w:rFonts w:ascii="Arial" w:hAnsi="Arial" w:eastAsia="Arial"/>
                 <w:b/>
+                <w:sz w:val="19"/>
               </w:rPr>
-              <w:t>Email</w:t>
+              <w:t>Method</w:t>
             </w:r>
           </w:p>
         </w:tc>
         <w:tc>
           <w:tcPr>
-            <w:tcW w:type="dxa" w:w="2484"/>
-            <w:shd w:fill="D9EAF7"/>
+            <w:tcW w:type="dxa" w:w="3360"/>
+            <w:shd w:fill="E5E7EB"/>
           </w:tcPr>
           <w:p>
             <w:r>
               <w:rPr>
+                <w:rFonts w:ascii="Arial" w:hAnsi="Arial" w:eastAsia="Arial"/>
                 <w:b/>
+                <w:sz w:val="19"/>
               </w:rPr>
-              <w:t>M?t kh?u g?c</w:t>
+              <w:t>Endpoint</w:t>
             </w:r>
           </w:p>
         </w:tc>
         <w:tc>
           <w:tcPr>
-            <w:tcW w:type="dxa" w:w="2484"/>
-            <w:shd w:fill="D9EAF7"/>
+            <w:tcW w:type="dxa" w:w="3360"/>
+            <w:shd w:fill="E5E7EB"/>
           </w:tcPr>
           <w:p>
             <w:r>
               <w:rPr>
+                <w:rFonts w:ascii="Arial" w:hAnsi="Arial" w:eastAsia="Arial"/>
                 <w:b/>
+                <w:sz w:val="19"/>
               </w:rPr>
-              <w:t>Quy?n</w:t>
-            </w:r>
-          </w:p>
-        </w:tc>
-        <w:tc>
-          <w:tcPr>
-            <w:tcW w:type="dxa" w:w="2484"/>
-            <w:shd w:fill="D9EAF7"/>
-          </w:tcPr>
-          <w:p>
-            <w:r>
-              <w:rPr>
-                <w:b/>
-              </w:rPr>
-              <w:t>?i?u h??ng</w:t>
+              <w:t>Mô tả</w:t>
             </w:r>
           </w:p>
         </w:tc>
@@ -388,45 +494,43 @@
       <w:tr>
         <w:tc>
           <w:tcPr>
-            <w:tcW w:type="dxa" w:w="2484"/>
-            <w:vAlign w:val="center"/>
+            <w:tcW w:type="dxa" w:w="3360"/>
           </w:tcPr>
           <w:p>
             <w:r>
-              <w:t>admin1@fashionshop.vn</w:t>
+              <w:rPr>
+                <w:rFonts w:ascii="Arial" w:hAnsi="Arial" w:eastAsia="Arial"/>
+                <w:sz w:val="19"/>
+              </w:rPr>
+              <w:t>POST</w:t>
             </w:r>
           </w:p>
         </w:tc>
         <w:tc>
           <w:tcPr>
-            <w:tcW w:type="dxa" w:w="2484"/>
-            <w:vAlign w:val="center"/>
+            <w:tcW w:type="dxa" w:w="3360"/>
           </w:tcPr>
           <w:p>
             <w:r>
-              <w:t>Admin@123</w:t>
+              <w:rPr>
+                <w:rFonts w:ascii="Arial" w:hAnsi="Arial" w:eastAsia="Arial"/>
+                <w:sz w:val="19"/>
+              </w:rPr>
+              <w:t>/api/chatbot</w:t>
             </w:r>
           </w:p>
         </w:tc>
         <w:tc>
           <w:tcPr>
-            <w:tcW w:type="dxa" w:w="2484"/>
-            <w:vAlign w:val="center"/>
+            <w:tcW w:type="dxa" w:w="3360"/>
           </w:tcPr>
           <w:p>
             <w:r>
-              <w:t>ROLE_ADMIN</w:t>
-            </w:r>
-          </w:p>
-        </w:tc>
-        <w:tc>
-          <w:tcPr>
-            <w:tcW w:type="dxa" w:w="2484"/>
-            <w:vAlign w:val="center"/>
-          </w:tcPr>
-          <w:p>
-            <w:r>
-              <w:t>/admin/dashboard</w:t>
+              <w:rPr>
+                <w:rFonts w:ascii="Arial" w:hAnsi="Arial" w:eastAsia="Arial"/>
+                <w:sz w:val="19"/>
+              </w:rPr>
+              <w:t>Nhận {"message":"..."}, trả JSON {"reply":"..."}.</w:t>
             </w:r>
           </w:p>
         </w:tc>
@@ -434,1815 +538,43 @@
       <w:tr>
         <w:tc>
           <w:tcPr>
-            <w:tcW w:type="dxa" w:w="2484"/>
-            <w:vAlign w:val="center"/>
-          </w:tcPr>
-          <w:p>
-            <w:r>
-              <w:t>admin2@fashionshop.vn</w:t>
-            </w:r>
-          </w:p>
-        </w:tc>
-        <w:tc>
-          <w:tcPr>
-            <w:tcW w:type="dxa" w:w="2484"/>
-            <w:vAlign w:val="center"/>
-          </w:tcPr>
-          <w:p>
-            <w:r>
-              <w:t>Admin@123</w:t>
-            </w:r>
-          </w:p>
-        </w:tc>
-        <w:tc>
-          <w:tcPr>
-            <w:tcW w:type="dxa" w:w="2484"/>
-            <w:vAlign w:val="center"/>
-          </w:tcPr>
-          <w:p>
-            <w:r>
-              <w:t>ROLE_ADMIN</w:t>
-            </w:r>
-          </w:p>
-        </w:tc>
-        <w:tc>
-          <w:tcPr>
-            <w:tcW w:type="dxa" w:w="2484"/>
-            <w:vAlign w:val="center"/>
-          </w:tcPr>
-          <w:p>
-            <w:r>
-              <w:t>/admin/dashboard</w:t>
-            </w:r>
-          </w:p>
-        </w:tc>
-      </w:tr>
-      <w:tr>
-        <w:tc>
-          <w:tcPr>
-            <w:tcW w:type="dxa" w:w="2484"/>
-            <w:vAlign w:val="center"/>
-          </w:tcPr>
-          <w:p>
-            <w:r>
-              <w:t>khach1@gmail.com</w:t>
-            </w:r>
-          </w:p>
-        </w:tc>
-        <w:tc>
-          <w:tcPr>
-            <w:tcW w:type="dxa" w:w="2484"/>
-            <w:vAlign w:val="center"/>
-          </w:tcPr>
-          <w:p>
-            <w:r>
-              <w:t>Khach@123</w:t>
-            </w:r>
-          </w:p>
-        </w:tc>
-        <w:tc>
-          <w:tcPr>
-            <w:tcW w:type="dxa" w:w="2484"/>
-            <w:vAlign w:val="center"/>
-          </w:tcPr>
-          <w:p>
-            <w:r>
-              <w:t>ROLE_CUSTOMER</w:t>
-            </w:r>
-          </w:p>
-        </w:tc>
-        <w:tc>
-          <w:tcPr>
-            <w:tcW w:type="dxa" w:w="2484"/>
-            <w:vAlign w:val="center"/>
-          </w:tcPr>
-          <w:p>
-            <w:r>
-              <w:t>/</w:t>
-            </w:r>
-          </w:p>
-        </w:tc>
-      </w:tr>
-      <w:tr>
-        <w:tc>
-          <w:tcPr>
-            <w:tcW w:type="dxa" w:w="2484"/>
-            <w:vAlign w:val="center"/>
-          </w:tcPr>
-          <w:p>
-            <w:r>
-              <w:t>khach2@gmail.com</w:t>
-            </w:r>
-          </w:p>
-        </w:tc>
-        <w:tc>
-          <w:tcPr>
-            <w:tcW w:type="dxa" w:w="2484"/>
-            <w:vAlign w:val="center"/>
-          </w:tcPr>
-          <w:p>
-            <w:r>
-              <w:t>Khach@123</w:t>
-            </w:r>
-          </w:p>
-        </w:tc>
-        <w:tc>
-          <w:tcPr>
-            <w:tcW w:type="dxa" w:w="2484"/>
-            <w:vAlign w:val="center"/>
-          </w:tcPr>
-          <w:p>
-            <w:r>
-              <w:t>ROLE_CUSTOMER</w:t>
-            </w:r>
-          </w:p>
-        </w:tc>
-        <w:tc>
-          <w:tcPr>
-            <w:tcW w:type="dxa" w:w="2484"/>
-            <w:vAlign w:val="center"/>
-          </w:tcPr>
-          <w:p>
-            <w:r>
-              <w:t>/</w:t>
-            </w:r>
-          </w:p>
-        </w:tc>
-      </w:tr>
-    </w:tbl>
-    <w:p/>
-    <w:p>
-      <w:pPr>
-        <w:pStyle w:val="Heading1"/>
-      </w:pPr>
-      <w:r>
-        <w:t>4. Ch?c n?ng v? tuy?n ???ng</w:t>
-      </w:r>
-    </w:p>
-    <w:p>
-      <w:pPr>
-        <w:pStyle w:val="Heading2"/>
-      </w:pPr>
-      <w:r>
-        <w:t>4.1. Kh?ch h?ng v? x?c th?c</w:t>
-      </w:r>
-    </w:p>
-    <w:tbl>
-      <w:tblPr>
-        <w:tblStyle w:val="TableGrid"/>
-        <w:tblW w:type="auto" w:w="0"/>
-        <w:jc w:val="center"/>
-        <w:tblLook w:firstColumn="1" w:firstRow="1" w:lastColumn="0" w:lastRow="0" w:noHBand="0" w:noVBand="1" w:val="04A0"/>
-      </w:tblPr>
-      <w:tblGrid>
-        <w:gridCol w:w="3312"/>
-        <w:gridCol w:w="3312"/>
-        <w:gridCol w:w="3312"/>
-      </w:tblGrid>
-      <w:tr>
-        <w:tc>
-          <w:tcPr>
-            <w:tcW w:type="dxa" w:w="3312"/>
-            <w:shd w:fill="D9EAF7"/>
+            <w:tcW w:type="dxa" w:w="3360"/>
           </w:tcPr>
           <w:p>
             <w:r>
               <w:rPr>
-                <w:b/>
+                <w:rFonts w:ascii="Arial" w:hAnsi="Arial" w:eastAsia="Arial"/>
+                <w:sz w:val="19"/>
               </w:rPr>
-              <w:t>Method</w:t>
-            </w:r>
-          </w:p>
-        </w:tc>
-        <w:tc>
-          <w:tcPr>
-            <w:tcW w:type="dxa" w:w="3312"/>
-            <w:shd w:fill="D9EAF7"/>
-          </w:tcPr>
-          <w:p>
-            <w:r>
-              <w:rPr>
-                <w:b/>
-              </w:rPr>
-              <w:t>Route</w:t>
-            </w:r>
-          </w:p>
-        </w:tc>
-        <w:tc>
-          <w:tcPr>
-            <w:tcW w:type="dxa" w:w="3312"/>
-            <w:shd w:fill="D9EAF7"/>
-          </w:tcPr>
-          <w:p>
-            <w:r>
-              <w:rPr>
-                <w:b/>
-              </w:rPr>
-              <w:t>Ch?c n?ng</w:t>
-            </w:r>
-          </w:p>
-        </w:tc>
-      </w:tr>
-      <w:tr>
-        <w:tc>
-          <w:tcPr>
-            <w:tcW w:type="dxa" w:w="3312"/>
-            <w:vAlign w:val="center"/>
-          </w:tcPr>
-          <w:p>
-            <w:r>
-              <w:t>GET</w:t>
-            </w:r>
-          </w:p>
-        </w:tc>
-        <w:tc>
-          <w:tcPr>
-            <w:tcW w:type="dxa" w:w="3312"/>
-            <w:vAlign w:val="center"/>
-          </w:tcPr>
-          <w:p>
-            <w:r>
-              <w:t>/</w:t>
-            </w:r>
-          </w:p>
-        </w:tc>
-        <w:tc>
-          <w:tcPr>
-            <w:tcW w:type="dxa" w:w="3312"/>
-            <w:vAlign w:val="center"/>
-          </w:tcPr>
-          <w:p>
-            <w:r>
-              <w:t>Trang ch? storefront</w:t>
-            </w:r>
-          </w:p>
-        </w:tc>
-      </w:tr>
-      <w:tr>
-        <w:tc>
-          <w:tcPr>
-            <w:tcW w:type="dxa" w:w="3312"/>
-            <w:vAlign w:val="center"/>
-          </w:tcPr>
-          <w:p>
-            <w:r>
-              <w:t>GET</w:t>
-            </w:r>
-          </w:p>
-        </w:tc>
-        <w:tc>
-          <w:tcPr>
-            <w:tcW w:type="dxa" w:w="3312"/>
-            <w:vAlign w:val="center"/>
-          </w:tcPr>
-          <w:p>
-            <w:r>
-              <w:t>/shop</w:t>
-            </w:r>
-          </w:p>
-        </w:tc>
-        <w:tc>
-          <w:tcPr>
-            <w:tcW w:type="dxa" w:w="3312"/>
-            <w:vAlign w:val="center"/>
-          </w:tcPr>
-          <w:p>
-            <w:r>
-              <w:t>Danh s?ch v? t?m ki?m s?n ph?m</w:t>
-            </w:r>
-          </w:p>
-        </w:tc>
-      </w:tr>
-      <w:tr>
-        <w:tc>
-          <w:tcPr>
-            <w:tcW w:type="dxa" w:w="3312"/>
-            <w:vAlign w:val="center"/>
-          </w:tcPr>
-          <w:p>
-            <w:r>
-              <w:t>GET</w:t>
-            </w:r>
-          </w:p>
-        </w:tc>
-        <w:tc>
-          <w:tcPr>
-            <w:tcW w:type="dxa" w:w="3312"/>
-            <w:vAlign w:val="center"/>
-          </w:tcPr>
-          <w:p>
-            <w:r>
-              <w:t>/shop/{id}</w:t>
-            </w:r>
-          </w:p>
-        </w:tc>
-        <w:tc>
-          <w:tcPr>
-            <w:tcW w:type="dxa" w:w="3312"/>
-            <w:vAlign w:val="center"/>
-          </w:tcPr>
-          <w:p>
-            <w:r>
-              <w:t>Chi ti?t s?n ph?m; ch? hi?n th? s?n ph?m ho?t ??ng thu?c danh m?c hi?n th?</w:t>
-            </w:r>
-          </w:p>
-        </w:tc>
-      </w:tr>
-      <w:tr>
-        <w:tc>
-          <w:tcPr>
-            <w:tcW w:type="dxa" w:w="3312"/>
-            <w:vAlign w:val="center"/>
-          </w:tcPr>
-          <w:p>
-            <w:r>
-              <w:t>GET</w:t>
-            </w:r>
-          </w:p>
-        </w:tc>
-        <w:tc>
-          <w:tcPr>
-            <w:tcW w:type="dxa" w:w="3312"/>
-            <w:vAlign w:val="center"/>
-          </w:tcPr>
-          <w:p>
-            <w:r>
-              <w:t>/sale</w:t>
-            </w:r>
-          </w:p>
-        </w:tc>
-        <w:tc>
-          <w:tcPr>
-            <w:tcW w:type="dxa" w:w="3312"/>
-            <w:vAlign w:val="center"/>
-          </w:tcPr>
-          <w:p>
-            <w:r>
-              <w:t>S?n ph?m khuy?n m?i</w:t>
-            </w:r>
-          </w:p>
-        </w:tc>
-      </w:tr>
-      <w:tr>
-        <w:tc>
-          <w:tcPr>
-            <w:tcW w:type="dxa" w:w="3312"/>
-            <w:vAlign w:val="center"/>
-          </w:tcPr>
-          <w:p>
-            <w:r>
-              <w:t>GET</w:t>
-            </w:r>
-          </w:p>
-        </w:tc>
-        <w:tc>
-          <w:tcPr>
-            <w:tcW w:type="dxa" w:w="3312"/>
-            <w:vAlign w:val="center"/>
-          </w:tcPr>
-          <w:p>
-            <w:r>
-              <w:t>/cart</w:t>
-            </w:r>
-          </w:p>
-        </w:tc>
-        <w:tc>
-          <w:tcPr>
-            <w:tcW w:type="dxa" w:w="3312"/>
-            <w:vAlign w:val="center"/>
-          </w:tcPr>
-          <w:p>
-            <w:r>
-              <w:t>Khung giao di?n gi? h?ng</w:t>
-            </w:r>
-          </w:p>
-        </w:tc>
-      </w:tr>
-      <w:tr>
-        <w:tc>
-          <w:tcPr>
-            <w:tcW w:type="dxa" w:w="3312"/>
-            <w:vAlign w:val="center"/>
-          </w:tcPr>
-          <w:p>
-            <w:r>
-              <w:t>GET</w:t>
-            </w:r>
-          </w:p>
-        </w:tc>
-        <w:tc>
-          <w:tcPr>
-            <w:tcW w:type="dxa" w:w="3312"/>
-            <w:vAlign w:val="center"/>
-          </w:tcPr>
-          <w:p>
-            <w:r>
-              <w:t>/checkout</w:t>
-            </w:r>
-          </w:p>
-        </w:tc>
-        <w:tc>
-          <w:tcPr>
-            <w:tcW w:type="dxa" w:w="3312"/>
-            <w:vAlign w:val="center"/>
-          </w:tcPr>
-          <w:p>
-            <w:r>
-              <w:t>Khung giao di?n thanh to?n</w:t>
-            </w:r>
-          </w:p>
-        </w:tc>
-      </w:tr>
-      <w:tr>
-        <w:tc>
-          <w:tcPr>
-            <w:tcW w:type="dxa" w:w="3312"/>
-            <w:vAlign w:val="center"/>
-          </w:tcPr>
-          <w:p>
-            <w:r>
-              <w:t>GET</w:t>
-            </w:r>
-          </w:p>
-        </w:tc>
-        <w:tc>
-          <w:tcPr>
-            <w:tcW w:type="dxa" w:w="3312"/>
-            <w:vAlign w:val="center"/>
-          </w:tcPr>
-          <w:p>
-            <w:r>
-              <w:t>/orders</w:t>
-            </w:r>
-          </w:p>
-        </w:tc>
-        <w:tc>
-          <w:tcPr>
-            <w:tcW w:type="dxa" w:w="3312"/>
-            <w:vAlign w:val="center"/>
-          </w:tcPr>
-          <w:p>
-            <w:r>
-              <w:t>L?ch s? ??n h?ng theo t?i kho?n</w:t>
-            </w:r>
-          </w:p>
-        </w:tc>
-      </w:tr>
-      <w:tr>
-        <w:tc>
-          <w:tcPr>
-            <w:tcW w:type="dxa" w:w="3312"/>
-            <w:vAlign w:val="center"/>
-          </w:tcPr>
-          <w:p>
-            <w:r>
-              <w:t>GET</w:t>
-            </w:r>
-          </w:p>
-        </w:tc>
-        <w:tc>
-          <w:tcPr>
-            <w:tcW w:type="dxa" w:w="3312"/>
-            <w:vAlign w:val="center"/>
-          </w:tcPr>
-          <w:p>
-            <w:r>
-              <w:t>/wishlist</w:t>
-            </w:r>
-          </w:p>
-        </w:tc>
-        <w:tc>
-          <w:tcPr>
-            <w:tcW w:type="dxa" w:w="3312"/>
-            <w:vAlign w:val="center"/>
-          </w:tcPr>
-          <w:p>
-            <w:r>
-              <w:t>Khung giao di?n y?u th?ch</w:t>
-            </w:r>
-          </w:p>
-        </w:tc>
-      </w:tr>
-      <w:tr>
-        <w:tc>
-          <w:tcPr>
-            <w:tcW w:type="dxa" w:w="3312"/>
-            <w:vAlign w:val="center"/>
-          </w:tcPr>
-          <w:p>
-            <w:r>
-              <w:t>GET</w:t>
-            </w:r>
-          </w:p>
-        </w:tc>
-        <w:tc>
-          <w:tcPr>
-            <w:tcW w:type="dxa" w:w="3312"/>
-            <w:vAlign w:val="center"/>
-          </w:tcPr>
-          <w:p>
-            <w:r>
-              <w:t>/account</w:t>
-            </w:r>
-          </w:p>
-        </w:tc>
-        <w:tc>
-          <w:tcPr>
-            <w:tcW w:type="dxa" w:w="3312"/>
-            <w:vAlign w:val="center"/>
-          </w:tcPr>
-          <w:p>
-            <w:r>
-              <w:t>Th?ng tin t?i kho?n</w:t>
-            </w:r>
-          </w:p>
-        </w:tc>
-      </w:tr>
-      <w:tr>
-        <w:tc>
-          <w:tcPr>
-            <w:tcW w:type="dxa" w:w="3312"/>
-            <w:vAlign w:val="center"/>
-          </w:tcPr>
-          <w:p>
-            <w:r>
-              <w:t>GET/POST</w:t>
-            </w:r>
-          </w:p>
-        </w:tc>
-        <w:tc>
-          <w:tcPr>
-            <w:tcW w:type="dxa" w:w="3312"/>
-            <w:vAlign w:val="center"/>
-          </w:tcPr>
-          <w:p>
-            <w:r>
-              <w:t>/register</w:t>
-            </w:r>
-          </w:p>
-        </w:tc>
-        <w:tc>
-          <w:tcPr>
-            <w:tcW w:type="dxa" w:w="3312"/>
-            <w:vAlign w:val="center"/>
-          </w:tcPr>
-          <w:p>
-            <w:r>
-              <w:t>??ng k? t?i kho?n</w:t>
-            </w:r>
-          </w:p>
-        </w:tc>
-      </w:tr>
-      <w:tr>
-        <w:tc>
-          <w:tcPr>
-            <w:tcW w:type="dxa" w:w="3312"/>
-            <w:vAlign w:val="center"/>
-          </w:tcPr>
-          <w:p>
-            <w:r>
-              <w:t>GET</w:t>
-            </w:r>
-          </w:p>
-        </w:tc>
-        <w:tc>
-          <w:tcPr>
-            <w:tcW w:type="dxa" w:w="3312"/>
-            <w:vAlign w:val="center"/>
-          </w:tcPr>
-          <w:p>
-            <w:r>
-              <w:t>/login</w:t>
-            </w:r>
-          </w:p>
-        </w:tc>
-        <w:tc>
-          <w:tcPr>
-            <w:tcW w:type="dxa" w:w="3312"/>
-            <w:vAlign w:val="center"/>
-          </w:tcPr>
-          <w:p>
-            <w:r>
-              <w:t>??ng nh?p</w:t>
-            </w:r>
-          </w:p>
-        </w:tc>
-      </w:tr>
-      <w:tr>
-        <w:tc>
-          <w:tcPr>
-            <w:tcW w:type="dxa" w:w="3312"/>
-            <w:vAlign w:val="center"/>
-          </w:tcPr>
-          <w:p>
-            <w:r>
-              <w:t>GET</w:t>
-            </w:r>
-          </w:p>
-        </w:tc>
-        <w:tc>
-          <w:tcPr>
-            <w:tcW w:type="dxa" w:w="3312"/>
-            <w:vAlign w:val="center"/>
-          </w:tcPr>
-          <w:p>
-            <w:r>
-              <w:t>/logout</w:t>
-            </w:r>
-          </w:p>
-        </w:tc>
-        <w:tc>
-          <w:tcPr>
-            <w:tcW w:type="dxa" w:w="3312"/>
-            <w:vAlign w:val="center"/>
-          </w:tcPr>
-          <w:p>
-            <w:r>
-              <w:t>??ng xu?t</w:t>
-            </w:r>
-          </w:p>
-        </w:tc>
-      </w:tr>
-    </w:tbl>
-    <w:p/>
-    <w:p>
-      <w:pPr>
-        <w:pStyle w:val="Heading2"/>
-      </w:pPr>
-      <w:r>
-        <w:t>4.2. Qu?n tr?</w:t>
-      </w:r>
-    </w:p>
-    <w:p>
-      <w:r>
-        <w:t>To?n b? route /admin/** y?u c?u ROLE_ADMIN. Storefront ???c m? c?ng khai theo SecurityConfig.</w:t>
-      </w:r>
-    </w:p>
-    <w:tbl>
-      <w:tblPr>
-        <w:tblStyle w:val="TableGrid"/>
-        <w:tblW w:type="auto" w:w="0"/>
-        <w:jc w:val="center"/>
-        <w:tblLook w:firstColumn="1" w:firstRow="1" w:lastColumn="0" w:lastRow="0" w:noHBand="0" w:noVBand="1" w:val="04A0"/>
-      </w:tblPr>
-      <w:tblGrid>
-        <w:gridCol w:w="4968"/>
-        <w:gridCol w:w="4968"/>
-      </w:tblGrid>
-      <w:tr>
-        <w:tc>
-          <w:tcPr>
-            <w:tcW w:type="dxa" w:w="4968"/>
-            <w:shd w:fill="D9EAF7"/>
-          </w:tcPr>
-          <w:p>
-            <w:r>
-              <w:rPr>
-                <w:b/>
-              </w:rPr>
-              <w:t>Route</w:t>
-            </w:r>
-          </w:p>
-        </w:tc>
-        <w:tc>
-          <w:tcPr>
-            <w:tcW w:type="dxa" w:w="4968"/>
-            <w:shd w:fill="D9EAF7"/>
-          </w:tcPr>
-          <w:p>
-            <w:r>
-              <w:rPr>
-                <w:b/>
-              </w:rPr>
-              <w:t>Ch?c n?ng</w:t>
-            </w:r>
-          </w:p>
-        </w:tc>
-      </w:tr>
-      <w:tr>
-        <w:tc>
-          <w:tcPr>
-            <w:tcW w:type="dxa" w:w="4968"/>
-            <w:vAlign w:val="center"/>
-          </w:tcPr>
-          <w:p>
-            <w:r>
-              <w:t>/admin ho?c /admin/dashboard</w:t>
-            </w:r>
-          </w:p>
-        </w:tc>
-        <w:tc>
-          <w:tcPr>
-            <w:tcW w:type="dxa" w:w="4968"/>
-            <w:vAlign w:val="center"/>
-          </w:tcPr>
-          <w:p>
-            <w:r>
-              <w:t>Dashboard</w:t>
-            </w:r>
-          </w:p>
-        </w:tc>
-      </w:tr>
-      <w:tr>
-        <w:tc>
-          <w:tcPr>
-            <w:tcW w:type="dxa" w:w="4968"/>
-            <w:vAlign w:val="center"/>
-          </w:tcPr>
-          <w:p>
-            <w:r>
-              <w:t>/admin/categories</w:t>
-            </w:r>
-          </w:p>
-        </w:tc>
-        <w:tc>
-          <w:tcPr>
-            <w:tcW w:type="dxa" w:w="4968"/>
-            <w:vAlign w:val="center"/>
-          </w:tcPr>
-          <w:p>
-            <w:r>
-              <w:t>Danh m?c</w:t>
-            </w:r>
-          </w:p>
-        </w:tc>
-      </w:tr>
-      <w:tr>
-        <w:tc>
-          <w:tcPr>
-            <w:tcW w:type="dxa" w:w="4968"/>
-            <w:vAlign w:val="center"/>
-          </w:tcPr>
-          <w:p>
-            <w:r>
-              <w:t>/admin/products</w:t>
-            </w:r>
-          </w:p>
-        </w:tc>
-        <w:tc>
-          <w:tcPr>
-            <w:tcW w:type="dxa" w:w="4968"/>
-            <w:vAlign w:val="center"/>
-          </w:tcPr>
-          <w:p>
-            <w:r>
-              <w:t>S?n ph?m v? bi?n th?</w:t>
-            </w:r>
-          </w:p>
-        </w:tc>
-      </w:tr>
-      <w:tr>
-        <w:tc>
-          <w:tcPr>
-            <w:tcW w:type="dxa" w:w="4968"/>
-            <w:vAlign w:val="center"/>
-          </w:tcPr>
-          <w:p>
-            <w:r>
-              <w:t>/admin/inventory</w:t>
-            </w:r>
-          </w:p>
-        </w:tc>
-        <w:tc>
-          <w:tcPr>
-            <w:tcW w:type="dxa" w:w="4968"/>
-            <w:vAlign w:val="center"/>
-          </w:tcPr>
-          <w:p>
-            <w:r>
-              <w:t>T?n kho</w:t>
-            </w:r>
-          </w:p>
-        </w:tc>
-      </w:tr>
-      <w:tr>
-        <w:tc>
-          <w:tcPr>
-            <w:tcW w:type="dxa" w:w="4968"/>
-            <w:vAlign w:val="center"/>
-          </w:tcPr>
-          <w:p>
-            <w:r>
-              <w:t>/admin/orders</w:t>
-            </w:r>
-          </w:p>
-        </w:tc>
-        <w:tc>
-          <w:tcPr>
-            <w:tcW w:type="dxa" w:w="4968"/>
-            <w:vAlign w:val="center"/>
-          </w:tcPr>
-          <w:p>
-            <w:r>
-              <w:t>??n h?ng</w:t>
-            </w:r>
-          </w:p>
-        </w:tc>
-      </w:tr>
-      <w:tr>
-        <w:tc>
-          <w:tcPr>
-            <w:tcW w:type="dxa" w:w="4968"/>
-            <w:vAlign w:val="center"/>
-          </w:tcPr>
-          <w:p>
-            <w:r>
-              <w:t>/admin/coupons</w:t>
-            </w:r>
-          </w:p>
-        </w:tc>
-        <w:tc>
-          <w:tcPr>
-            <w:tcW w:type="dxa" w:w="4968"/>
-            <w:vAlign w:val="center"/>
-          </w:tcPr>
-          <w:p>
-            <w:r>
-              <w:t>M? gi?m gi?</w:t>
-            </w:r>
-          </w:p>
-        </w:tc>
-      </w:tr>
-      <w:tr>
-        <w:tc>
-          <w:tcPr>
-            <w:tcW w:type="dxa" w:w="4968"/>
-            <w:vAlign w:val="center"/>
-          </w:tcPr>
-          <w:p>
-            <w:r>
-              <w:t>/admin/users</w:t>
-            </w:r>
-          </w:p>
-        </w:tc>
-        <w:tc>
-          <w:tcPr>
-            <w:tcW w:type="dxa" w:w="4968"/>
-            <w:vAlign w:val="center"/>
-          </w:tcPr>
-          <w:p>
-            <w:r>
-              <w:t>Ng??i d?ng</w:t>
-            </w:r>
-          </w:p>
-        </w:tc>
-      </w:tr>
-      <w:tr>
-        <w:tc>
-          <w:tcPr>
-            <w:tcW w:type="dxa" w:w="4968"/>
-            <w:vAlign w:val="center"/>
-          </w:tcPr>
-          <w:p>
-            <w:r>
-              <w:t>/admin/statistics</w:t>
-            </w:r>
-          </w:p>
-        </w:tc>
-        <w:tc>
-          <w:tcPr>
-            <w:tcW w:type="dxa" w:w="4968"/>
-            <w:vAlign w:val="center"/>
-          </w:tcPr>
-          <w:p>
-            <w:r>
-              <w:t>Khung giao di?n th?ng k?</w:t>
-            </w:r>
-          </w:p>
-        </w:tc>
-      </w:tr>
-      <w:tr>
-        <w:tc>
-          <w:tcPr>
-            <w:tcW w:type="dxa" w:w="4968"/>
-            <w:vAlign w:val="center"/>
-          </w:tcPr>
-          <w:p>
-            <w:r>
-              <w:t>/admin/settings</w:t>
-            </w:r>
-          </w:p>
-        </w:tc>
-        <w:tc>
-          <w:tcPr>
-            <w:tcW w:type="dxa" w:w="4968"/>
-            <w:vAlign w:val="center"/>
-          </w:tcPr>
-          <w:p>
-            <w:r>
-              <w:t>Tr? gi?p v? thi?t l?p</w:t>
-            </w:r>
-          </w:p>
-        </w:tc>
-      </w:tr>
-    </w:tbl>
-    <w:p/>
-    <w:p>
-      <w:pPr>
-        <w:pStyle w:val="Heading2"/>
-      </w:pPr>
-      <w:r>
-        <w:t>4.3. Chatbot t? v?n s?n ph?m</w:t>
-      </w:r>
-    </w:p>
-    <w:p>
-      <w:r>
-        <w:t>Chatbot ???c hi?n th? t? fragments/chatbox.html trong layout user-base.html. Chatbot s? d?ng d? li?u s?n ph?m v? coupon c?a ?ng d?ng ?? tr? l?i c?u h?i ti?ng Vi?t, kh?ng ph? thu?c v?o d?ch v? AI b?n ngo?i.</w:t>
-      </w:r>
-    </w:p>
-    <w:tbl>
-      <w:tblPr>
-        <w:tblStyle w:val="TableGrid"/>
-        <w:tblW w:type="auto" w:w="0"/>
-        <w:jc w:val="center"/>
-        <w:tblLook w:firstColumn="1" w:firstRow="1" w:lastColumn="0" w:lastRow="0" w:noHBand="0" w:noVBand="1" w:val="04A0"/>
-      </w:tblPr>
-      <w:tblGrid>
-        <w:gridCol w:w="3312"/>
-        <w:gridCol w:w="3312"/>
-        <w:gridCol w:w="3312"/>
-      </w:tblGrid>
-      <w:tr>
-        <w:tc>
-          <w:tcPr>
-            <w:tcW w:type="dxa" w:w="3312"/>
-            <w:shd w:fill="D9EAF7"/>
-          </w:tcPr>
-          <w:p>
-            <w:r>
-              <w:rPr>
-                <w:b/>
-              </w:rPr>
-              <w:t>Method</w:t>
-            </w:r>
-          </w:p>
-        </w:tc>
-        <w:tc>
-          <w:tcPr>
-            <w:tcW w:type="dxa" w:w="3312"/>
-            <w:shd w:fill="D9EAF7"/>
-          </w:tcPr>
-          <w:p>
-            <w:r>
-              <w:rPr>
-                <w:b/>
-              </w:rPr>
-              <w:t>Endpoint</w:t>
-            </w:r>
-          </w:p>
-        </w:tc>
-        <w:tc>
-          <w:tcPr>
-            <w:tcW w:type="dxa" w:w="3312"/>
-            <w:shd w:fill="D9EAF7"/>
-          </w:tcPr>
-          <w:p>
-            <w:r>
-              <w:rPr>
-                <w:b/>
-              </w:rPr>
-              <w:t>M? t?</w:t>
-            </w:r>
-          </w:p>
-        </w:tc>
-      </w:tr>
-      <w:tr>
-        <w:tc>
-          <w:tcPr>
-            <w:tcW w:type="dxa" w:w="3312"/>
-            <w:vAlign w:val="center"/>
-          </w:tcPr>
-          <w:p>
-            <w:r>
               <w:t>POST</w:t>
             </w:r>
           </w:p>
         </w:tc>
         <w:tc>
           <w:tcPr>
-            <w:tcW w:type="dxa" w:w="3312"/>
-            <w:vAlign w:val="center"/>
+            <w:tcW w:type="dxa" w:w="3360"/>
           </w:tcPr>
           <w:p>
             <w:r>
-              <w:t>/api/chatbot</w:t>
-            </w:r>
-          </w:p>
-        </w:tc>
-        <w:tc>
-          <w:tcPr>
-            <w:tcW w:type="dxa" w:w="3312"/>
-            <w:vAlign w:val="center"/>
-          </w:tcPr>
-          <w:p>
-            <w:r>
-              <w:t>Nh?n {"message":"..."}, tr? JSON {"reply":"..."}.</w:t>
-            </w:r>
-          </w:p>
-        </w:tc>
-      </w:tr>
-      <w:tr>
-        <w:tc>
-          <w:tcPr>
-            <w:tcW w:type="dxa" w:w="3312"/>
-            <w:vAlign w:val="center"/>
-          </w:tcPr>
-          <w:p>
-            <w:r>
-              <w:t>POST</w:t>
-            </w:r>
-          </w:p>
-        </w:tc>
-        <w:tc>
-          <w:tcPr>
-            <w:tcW w:type="dxa" w:w="3312"/>
-            <w:vAlign w:val="center"/>
-          </w:tcPr>
-          <w:p>
-            <w:r>
+              <w:rPr>
+                <w:rFonts w:ascii="Arial" w:hAnsi="Arial" w:eastAsia="Arial"/>
+                <w:sz w:val="19"/>
+              </w:rPr>
               <w:t>/api/chatbot/stream</w:t>
             </w:r>
           </w:p>
         </w:tc>
         <w:tc>
           <w:tcPr>
-            <w:tcW w:type="dxa" w:w="3312"/>
-            <w:vAlign w:val="center"/>
-          </w:tcPr>
-          <w:p>
-            <w:r>
-              <w:t>Nh?n c?ng ??nh d?ng, tr? text/plain theo t?ng ?o?n ?? giao di?n hi?n th? d?n.</w:t>
-            </w:r>
-          </w:p>
-        </w:tc>
-      </w:tr>
-    </w:tbl>
-    <w:p/>
-    <w:p>
-      <w:pPr>
-        <w:pStyle w:val="ListBullet"/>
-      </w:pPr>
-      <w:r>
-        <w:t>Controller chu?n h?a tin nh?n v? gi?i h?n ?? d?i t?i ?a 500 k? t?.</w:t>
-      </w:r>
-    </w:p>
-    <w:p>
-      <w:pPr>
-        <w:pStyle w:val="ListBullet"/>
-      </w:pPr>
-      <w:r>
-        <w:t>Chatbot h? tr? c?u h?i v? coupon, s?n ph?m sale, kho?ng gi?, danh m?c, m?u, size, t?n kho v? ch?nh s?ch ??i tr?.</w:t>
-      </w:r>
-    </w:p>
-    <w:p>
-      <w:pPr>
-        <w:pStyle w:val="ListBullet"/>
-      </w:pPr>
-      <w:r>
-        <w:t>Ph?n h?i c? th? ch?a danh s?ch s?n ph?m ph? h?p v? li?n k?t ??n trang chi ti?t.</w:t>
-      </w:r>
-    </w:p>
-    <w:p>
-      <w:pPr>
-        <w:pStyle w:val="ListBullet"/>
-      </w:pPr>
-      <w:r>
-        <w:t>ChatbotService d?ng ProductDetailDto v? CouponRepository; c?c tr??ng h?p kh?ng c? d? li?u s? tr? l?i h??ng d?n thay v? t?o d? li?u gi?.</w:t>
-      </w:r>
-    </w:p>
-    <w:p>
-      <w:pPr>
-        <w:pStyle w:val="Heading1"/>
-      </w:pPr>
-      <w:r>
-        <w:t>5. C?u tr?c backend</w:t>
-      </w:r>
-    </w:p>
-    <w:tbl>
-      <w:tblPr>
-        <w:tblStyle w:val="TableGrid"/>
-        <w:tblW w:type="auto" w:w="0"/>
-        <w:jc w:val="center"/>
-        <w:tblLook w:firstColumn="1" w:firstRow="1" w:lastColumn="0" w:lastRow="0" w:noHBand="0" w:noVBand="1" w:val="04A0"/>
-      </w:tblPr>
-      <w:tblGrid>
-        <w:gridCol w:w="4968"/>
-        <w:gridCol w:w="4968"/>
-      </w:tblGrid>
-      <w:tr>
-        <w:tc>
-          <w:tcPr>
-            <w:tcW w:type="dxa" w:w="4968"/>
-            <w:shd w:fill="D9EAF7"/>
+            <w:tcW w:type="dxa" w:w="3360"/>
           </w:tcPr>
           <w:p>
             <w:r>
               <w:rPr>
-                <w:b/>
+                <w:rFonts w:ascii="Arial" w:hAnsi="Arial" w:eastAsia="Arial"/>
+                <w:sz w:val="19"/>
               </w:rPr>
-              <w:t>Th?nh ph?n</w:t>
-            </w:r>
-          </w:p>
-        </w:tc>
-        <w:tc>
-          <w:tcPr>
-            <w:tcW w:type="dxa" w:w="4968"/>
-            <w:shd w:fill="D9EAF7"/>
-          </w:tcPr>
-          <w:p>
-            <w:r>
-              <w:rPr>
-                <w:b/>
-              </w:rPr>
-              <w:t>Vai tr?</w:t>
-            </w:r>
-          </w:p>
-        </w:tc>
-      </w:tr>
-      <w:tr>
-        <w:tc>
-          <w:tcPr>
-            <w:tcW w:type="dxa" w:w="4968"/>
-            <w:vAlign w:val="center"/>
-          </w:tcPr>
-          <w:p>
-            <w:r>
-              <w:t>UserController, ShopController, SaleController</w:t>
-            </w:r>
-          </w:p>
-        </w:tc>
-        <w:tc>
-          <w:tcPr>
-            <w:tcW w:type="dxa" w:w="4968"/>
-            <w:vAlign w:val="center"/>
-          </w:tcPr>
-          <w:p>
-            <w:r>
-              <w:t>Trang ch?, danh s?ch/chi ti?t s?n ph?m v? sale.</w:t>
-            </w:r>
-          </w:p>
-        </w:tc>
-      </w:tr>
-      <w:tr>
-        <w:tc>
-          <w:tcPr>
-            <w:tcW w:type="dxa" w:w="4968"/>
-            <w:vAlign w:val="center"/>
-          </w:tcPr>
-          <w:p>
-            <w:r>
-              <w:t>AuthController, AccountController</w:t>
-            </w:r>
-          </w:p>
-        </w:tc>
-        <w:tc>
-          <w:tcPr>
-            <w:tcW w:type="dxa" w:w="4968"/>
-            <w:vAlign w:val="center"/>
-          </w:tcPr>
-          <w:p>
-            <w:r>
-              <w:t>??ng nh?p, ??ng k?, ??ng xu?t v? th?ng tin t?i kho?n.</w:t>
-            </w:r>
-          </w:p>
-        </w:tc>
-      </w:tr>
-      <w:tr>
-        <w:tc>
-          <w:tcPr>
-            <w:tcW w:type="dxa" w:w="4968"/>
-            <w:vAlign w:val="center"/>
-          </w:tcPr>
-          <w:p>
-            <w:r>
-              <w:t>OrderController, CartController, CheckoutController, WishlistController</w:t>
-            </w:r>
-          </w:p>
-        </w:tc>
-        <w:tc>
-          <w:tcPr>
-            <w:tcW w:type="dxa" w:w="4968"/>
-            <w:vAlign w:val="center"/>
-          </w:tcPr>
-          <w:p>
-            <w:r>
-              <w:t>C?c m?n h?nh ??n h?ng, gi? h?ng, thanh to?n v? y?u th?ch.</w:t>
-            </w:r>
-          </w:p>
-        </w:tc>
-      </w:tr>
-      <w:tr>
-        <w:tc>
-          <w:tcPr>
-            <w:tcW w:type="dxa" w:w="4968"/>
-            <w:vAlign w:val="center"/>
-          </w:tcPr>
-          <w:p>
-            <w:r>
-              <w:t>C?c Admin*Controller</w:t>
-            </w:r>
-          </w:p>
-        </w:tc>
-        <w:tc>
-          <w:tcPr>
-            <w:tcW w:type="dxa" w:w="4968"/>
-            <w:vAlign w:val="center"/>
-          </w:tcPr>
-          <w:p>
-            <w:r>
-              <w:t>C?c module qu?n tr? v? trang th?ng k?.</w:t>
-            </w:r>
-          </w:p>
-        </w:tc>
-      </w:tr>
-      <w:tr>
-        <w:tc>
-          <w:tcPr>
-            <w:tcW w:type="dxa" w:w="4968"/>
-            <w:vAlign w:val="center"/>
-          </w:tcPr>
-          <w:p>
-            <w:r>
-              <w:t>ProductService</w:t>
-            </w:r>
-          </w:p>
-        </w:tc>
-        <w:tc>
-          <w:tcPr>
-            <w:tcW w:type="dxa" w:w="4968"/>
-            <w:vAlign w:val="center"/>
-          </w:tcPr>
-          <w:p>
-            <w:r>
-              <w:t>L?y s?n ph?m storefront, t?o ProductDetailDto, t?nh gi? v? t?n kho.</w:t>
-            </w:r>
-          </w:p>
-        </w:tc>
-      </w:tr>
-      <w:tr>
-        <w:tc>
-          <w:tcPr>
-            <w:tcW w:type="dxa" w:w="4968"/>
-            <w:vAlign w:val="center"/>
-          </w:tcPr>
-          <w:p>
-            <w:r>
-              <w:t>ProductRepository</w:t>
-            </w:r>
-          </w:p>
-        </w:tc>
-        <w:tc>
-          <w:tcPr>
-            <w:tcW w:type="dxa" w:w="4968"/>
-            <w:vAlign w:val="center"/>
-          </w:tcPr>
-          <w:p>
-            <w:r>
-              <w:t>Truy v?n s?n ph?m chi ti?t v? s?n ph?m li?n quan.</w:t>
-            </w:r>
-          </w:p>
-        </w:tc>
-      </w:tr>
-      <w:tr>
-        <w:tc>
-          <w:tcPr>
-            <w:tcW w:type="dxa" w:w="4968"/>
-            <w:vAlign w:val="center"/>
-          </w:tcPr>
-          <w:p>
-            <w:r>
-              <w:t>ChatbotController/ChatbotService</w:t>
-            </w:r>
-          </w:p>
-        </w:tc>
-        <w:tc>
-          <w:tcPr>
-            <w:tcW w:type="dxa" w:w="4968"/>
-            <w:vAlign w:val="center"/>
-          </w:tcPr>
-          <w:p>
-            <w:r>
-              <w:t>API chatbot th??ng, streaming v? logic t? v?n s?n ph?m.</w:t>
-            </w:r>
-          </w:p>
-        </w:tc>
-      </w:tr>
-      <w:tr>
-        <w:tc>
-          <w:tcPr>
-            <w:tcW w:type="dxa" w:w="4968"/>
-            <w:vAlign w:val="center"/>
-          </w:tcPr>
-          <w:p>
-            <w:r>
-              <w:t>CouponRepository</w:t>
-            </w:r>
-          </w:p>
-        </w:tc>
-        <w:tc>
-          <w:tcPr>
-            <w:tcW w:type="dxa" w:w="4968"/>
-            <w:vAlign w:val="center"/>
-          </w:tcPr>
-          <w:p>
-            <w:r>
-              <w:t>Truy v?n d? li?u coupon cho c?c ch?c n?ng li?n quan.</w:t>
-            </w:r>
-          </w:p>
-        </w:tc>
-      </w:tr>
-      <w:tr>
-        <w:tc>
-          <w:tcPr>
-            <w:tcW w:type="dxa" w:w="4968"/>
-            <w:vAlign w:val="center"/>
-          </w:tcPr>
-          <w:p>
-            <w:r>
-              <w:t>ProductDetailDto</w:t>
-            </w:r>
-          </w:p>
-        </w:tc>
-        <w:tc>
-          <w:tcPr>
-            <w:tcW w:type="dxa" w:w="4968"/>
-            <w:vAlign w:val="center"/>
-          </w:tcPr>
-          <w:p>
-            <w:r>
-              <w:t>DTO d?ng chung cho trang chi ti?t v? chatbot.</w:t>
-            </w:r>
-          </w:p>
-        </w:tc>
-      </w:tr>
-    </w:tbl>
-    <w:p/>
-    <w:p>
-      <w:pPr>
-        <w:pStyle w:val="Heading1"/>
-      </w:pPr>
-      <w:r>
-        <w:t>6. B?o m?t</w:t>
-      </w:r>
-    </w:p>
-    <w:p>
-      <w:pPr>
-        <w:pStyle w:val="ListBullet"/>
-      </w:pPr>
-      <w:r>
-        <w:t>Cho ph?p t?i nguy?n t?nh v? c?c route ??ng nh?p/??ng k?/??ng xu?t.</w:t>
-      </w:r>
-    </w:p>
-    <w:p>
-      <w:pPr>
-        <w:pStyle w:val="ListBullet"/>
-      </w:pPr>
-      <w:r>
-        <w:t>B?o v? to?n b? /admin/** b?ng ROLE_ADMIN.</w:t>
-      </w:r>
-    </w:p>
-    <w:p>
-      <w:pPr>
-        <w:pStyle w:val="ListBullet"/>
-      </w:pPr>
-      <w:r>
-        <w:t>M? h?a m?t kh?u b?ng BCrypt v? ?nh x? role/tr?ng th?i t?i kho?n t? database.</w:t>
-      </w:r>
-    </w:p>
-    <w:p>
-      <w:pPr>
-        <w:pStyle w:val="ListBullet"/>
-      </w:pPr>
-      <w:r>
-        <w:t>??ng nh?p th?nh c?ng chuy?n admin ??n /admin/dashboard v? customer ??n /.</w:t>
-      </w:r>
-    </w:p>
-    <w:p>
-      <w:pPr>
-        <w:pStyle w:val="ListBullet"/>
-      </w:pPr>
-      <w:r>
-        <w:t>Logout h?y session, x?a cookie JSESSIONID v? chuy?n v? /login?logout=true.</w:t>
-      </w:r>
-    </w:p>
-    <w:p>
-      <w:pPr>
-        <w:pStyle w:val="ListBullet"/>
-      </w:pPr>
-      <w:r>
-        <w:t>C?u h?nh k?t n?i local kh?ng ???c commit m?t kh?u th?t; t?o application-local.properties theo c?u tr?c c?u h?nh c?a project v? thay m?t kh?u b?ng th?ng tin local c?a m?y.</w:t>
-      </w:r>
-    </w:p>
-    <w:p>
-      <w:pPr>
-        <w:pStyle w:val="Heading1"/>
-      </w:pPr>
-      <w:r>
-        <w:t>7. M? h?nh d? li?u</w:t>
-      </w:r>
-    </w:p>
-    <w:tbl>
-      <w:tblPr>
-        <w:tblStyle w:val="TableGrid"/>
-        <w:tblW w:type="auto" w:w="0"/>
-        <w:jc w:val="center"/>
-        <w:tblLook w:firstColumn="1" w:firstRow="1" w:lastColumn="0" w:lastRow="0" w:noHBand="0" w:noVBand="1" w:val="04A0"/>
-      </w:tblPr>
-      <w:tblGrid>
-        <w:gridCol w:w="3312"/>
-        <w:gridCol w:w="3312"/>
-        <w:gridCol w:w="3312"/>
-      </w:tblGrid>
-      <w:tr>
-        <w:tc>
-          <w:tcPr>
-            <w:tcW w:type="dxa" w:w="3312"/>
-            <w:shd w:fill="D9EAF7"/>
-          </w:tcPr>
-          <w:p>
-            <w:r>
-              <w:rPr>
-                <w:b/>
-              </w:rPr>
-              <w:t>Entity</w:t>
-            </w:r>
-          </w:p>
-        </w:tc>
-        <w:tc>
-          <w:tcPr>
-            <w:tcW w:type="dxa" w:w="3312"/>
-            <w:shd w:fill="D9EAF7"/>
-          </w:tcPr>
-          <w:p>
-            <w:r>
-              <w:rPr>
-                <w:b/>
-              </w:rPr>
-              <w:t>B?ng</w:t>
-            </w:r>
-          </w:p>
-        </w:tc>
-        <w:tc>
-          <w:tcPr>
-            <w:tcW w:type="dxa" w:w="3312"/>
-            <w:shd w:fill="D9EAF7"/>
-          </w:tcPr>
-          <w:p>
-            <w:r>
-              <w:rPr>
-                <w:b/>
-              </w:rPr>
-              <w:t>Vai tr?</w:t>
-            </w:r>
-          </w:p>
-        </w:tc>
-      </w:tr>
-      <w:tr>
-        <w:tc>
-          <w:tcPr>
-            <w:tcW w:type="dxa" w:w="3312"/>
-            <w:vAlign w:val="center"/>
-          </w:tcPr>
-          <w:p>
-            <w:r>
-              <w:t>Account</w:t>
-            </w:r>
-          </w:p>
-        </w:tc>
-        <w:tc>
-          <w:tcPr>
-            <w:tcW w:type="dxa" w:w="3312"/>
-            <w:vAlign w:val="center"/>
-          </w:tcPr>
-          <w:p>
-            <w:r>
-              <w:t>account</w:t>
-            </w:r>
-          </w:p>
-        </w:tc>
-        <w:tc>
-          <w:tcPr>
-            <w:tcW w:type="dxa" w:w="3312"/>
-            <w:vAlign w:val="center"/>
-          </w:tcPr>
-          <w:p>
-            <w:r>
-              <w:t>Email, m?t kh?u, role v? tr?ng th?i</w:t>
-            </w:r>
-          </w:p>
-        </w:tc>
-      </w:tr>
-      <w:tr>
-        <w:tc>
-          <w:tcPr>
-            <w:tcW w:type="dxa" w:w="3312"/>
-            <w:vAlign w:val="center"/>
-          </w:tcPr>
-          <w:p>
-            <w:r>
-              <w:t>UserProfile</w:t>
-            </w:r>
-          </w:p>
-        </w:tc>
-        <w:tc>
-          <w:tcPr>
-            <w:tcW w:type="dxa" w:w="3312"/>
-            <w:vAlign w:val="center"/>
-          </w:tcPr>
-          <w:p>
-            <w:r>
-              <w:t>user_profile</w:t>
-            </w:r>
-          </w:p>
-        </w:tc>
-        <w:tc>
-          <w:tcPr>
-            <w:tcW w:type="dxa" w:w="3312"/>
-            <w:vAlign w:val="center"/>
-          </w:tcPr>
-          <w:p>
-            <w:r>
-              <w:t>H? s? ng??i d?ng</w:t>
-            </w:r>
-          </w:p>
-        </w:tc>
-      </w:tr>
-      <w:tr>
-        <w:tc>
-          <w:tcPr>
-            <w:tcW w:type="dxa" w:w="3312"/>
-            <w:vAlign w:val="center"/>
-          </w:tcPr>
-          <w:p>
-            <w:r>
-              <w:t>ShippingAddress</w:t>
-            </w:r>
-          </w:p>
-        </w:tc>
-        <w:tc>
-          <w:tcPr>
-            <w:tcW w:type="dxa" w:w="3312"/>
-            <w:vAlign w:val="center"/>
-          </w:tcPr>
-          <w:p>
-            <w:r>
-              <w:t>shipping_address</w:t>
-            </w:r>
-          </w:p>
-        </w:tc>
-        <w:tc>
-          <w:tcPr>
-            <w:tcW w:type="dxa" w:w="3312"/>
-            <w:vAlign w:val="center"/>
-          </w:tcPr>
-          <w:p>
-            <w:r>
-              <w:t>??a ch? giao h?ng</w:t>
-            </w:r>
-          </w:p>
-        </w:tc>
-      </w:tr>
-      <w:tr>
-        <w:tc>
-          <w:tcPr>
-            <w:tcW w:type="dxa" w:w="3312"/>
-            <w:vAlign w:val="center"/>
-          </w:tcPr>
-          <w:p>
-            <w:r>
-              <w:t>Category</w:t>
-            </w:r>
-          </w:p>
-        </w:tc>
-        <w:tc>
-          <w:tcPr>
-            <w:tcW w:type="dxa" w:w="3312"/>
-            <w:vAlign w:val="center"/>
-          </w:tcPr>
-          <w:p>
-            <w:r>
-              <w:t>category</w:t>
-            </w:r>
-          </w:p>
-        </w:tc>
-        <w:tc>
-          <w:tcPr>
-            <w:tcW w:type="dxa" w:w="3312"/>
-            <w:vAlign w:val="center"/>
-          </w:tcPr>
-          <w:p>
-            <w:r>
-              <w:t>Danh m?c</w:t>
-            </w:r>
-          </w:p>
-        </w:tc>
-      </w:tr>
-      <w:tr>
-        <w:tc>
-          <w:tcPr>
-            <w:tcW w:type="dxa" w:w="3312"/>
-            <w:vAlign w:val="center"/>
-          </w:tcPr>
-          <w:p>
-            <w:r>
-              <w:t>Product</w:t>
-            </w:r>
-          </w:p>
-        </w:tc>
-        <w:tc>
-          <w:tcPr>
-            <w:tcW w:type="dxa" w:w="3312"/>
-            <w:vAlign w:val="center"/>
-          </w:tcPr>
-          <w:p>
-            <w:r>
-              <w:t>product</w:t>
-            </w:r>
-          </w:p>
-        </w:tc>
-        <w:tc>
-          <w:tcPr>
-            <w:tcW w:type="dxa" w:w="3312"/>
-            <w:vAlign w:val="center"/>
-          </w:tcPr>
-          <w:p>
-            <w:r>
-              <w:t>S?n ph?m, gi?, gi?i t?nh v? tr?ng th?i</w:t>
-            </w:r>
-          </w:p>
-        </w:tc>
-      </w:tr>
-      <w:tr>
-        <w:tc>
-          <w:tcPr>
-            <w:tcW w:type="dxa" w:w="3312"/>
-            <w:vAlign w:val="center"/>
-          </w:tcPr>
-          <w:p>
-            <w:r>
-              <w:t>ProductVariant</w:t>
-            </w:r>
-          </w:p>
-        </w:tc>
-        <w:tc>
-          <w:tcPr>
-            <w:tcW w:type="dxa" w:w="3312"/>
-            <w:vAlign w:val="center"/>
-          </w:tcPr>
-          <w:p>
-            <w:r>
-              <w:t>product_variant</w:t>
-            </w:r>
-          </w:p>
-        </w:tc>
-        <w:tc>
-          <w:tcPr>
-            <w:tcW w:type="dxa" w:w="3312"/>
-            <w:vAlign w:val="center"/>
-          </w:tcPr>
-          <w:p>
-            <w:r>
-              <w:t>Size, m?u, SKU v? t?n kho</w:t>
-            </w:r>
-          </w:p>
-        </w:tc>
-      </w:tr>
-      <w:tr>
-        <w:tc>
-          <w:tcPr>
-            <w:tcW w:type="dxa" w:w="3312"/>
-            <w:vAlign w:val="center"/>
-          </w:tcPr>
-          <w:p>
-            <w:r>
-              <w:t>Coupon</w:t>
-            </w:r>
-          </w:p>
-        </w:tc>
-        <w:tc>
-          <w:tcPr>
-            <w:tcW w:type="dxa" w:w="3312"/>
-            <w:vAlign w:val="center"/>
-          </w:tcPr>
-          <w:p>
-            <w:r>
-              <w:t>coupon</w:t>
-            </w:r>
-          </w:p>
-        </w:tc>
-        <w:tc>
-          <w:tcPr>
-            <w:tcW w:type="dxa" w:w="3312"/>
-            <w:vAlign w:val="center"/>
-          </w:tcPr>
-          <w:p>
-            <w:r>
-              <w:t>M? gi?m gi? v? gi?i h?n s? d?ng</w:t>
-            </w:r>
-          </w:p>
-        </w:tc>
-      </w:tr>
-      <w:tr>
-        <w:tc>
-          <w:tcPr>
-            <w:tcW w:type="dxa" w:w="3312"/>
-            <w:vAlign w:val="center"/>
-          </w:tcPr>
-          <w:p>
-            <w:r>
-              <w:t>Order/OrderItem</w:t>
-            </w:r>
-          </w:p>
-        </w:tc>
-        <w:tc>
-          <w:tcPr>
-            <w:tcW w:type="dxa" w:w="3312"/>
-            <w:vAlign w:val="center"/>
-          </w:tcPr>
-          <w:p>
-            <w:r>
-              <w:t>orders/order_item</w:t>
-            </w:r>
-          </w:p>
-        </w:tc>
-        <w:tc>
-          <w:tcPr>
-            <w:tcW w:type="dxa" w:w="3312"/>
-            <w:vAlign w:val="center"/>
-          </w:tcPr>
-          <w:p>
-            <w:r>
-              <w:t>??n h?ng v? snapshot s?n ph?m</w:t>
-            </w:r>
-          </w:p>
-        </w:tc>
-      </w:tr>
-      <w:tr>
-        <w:tc>
-          <w:tcPr>
-            <w:tcW w:type="dxa" w:w="3312"/>
-            <w:vAlign w:val="center"/>
-          </w:tcPr>
-          <w:p>
-            <w:r>
-              <w:t>StockHistory</w:t>
-            </w:r>
-          </w:p>
-        </w:tc>
-        <w:tc>
-          <w:tcPr>
-            <w:tcW w:type="dxa" w:w="3312"/>
-            <w:vAlign w:val="center"/>
-          </w:tcPr>
-          <w:p>
-            <w:r>
-              <w:t>stock_history</w:t>
-            </w:r>
-          </w:p>
-        </w:tc>
-        <w:tc>
-          <w:tcPr>
-            <w:tcW w:type="dxa" w:w="3312"/>
-            <w:vAlign w:val="center"/>
-          </w:tcPr>
-          <w:p>
-            <w:r>
-              <w:t>L?ch s? bi?n ??ng kho</w:t>
-            </w:r>
-          </w:p>
-        </w:tc>
-      </w:tr>
-      <w:tr>
-        <w:tc>
-          <w:tcPr>
-            <w:tcW w:type="dxa" w:w="3312"/>
-            <w:vAlign w:val="center"/>
-          </w:tcPr>
-          <w:p>
-            <w:r>
-              <w:t>CartItem/WishlistItem</w:t>
-            </w:r>
-          </w:p>
-        </w:tc>
-        <w:tc>
-          <w:tcPr>
-            <w:tcW w:type="dxa" w:w="3312"/>
-            <w:vAlign w:val="center"/>
-          </w:tcPr>
-          <w:p>
-            <w:r>
-              <w:t>cart_item/wishlist_item</w:t>
-            </w:r>
-          </w:p>
-        </w:tc>
-        <w:tc>
-          <w:tcPr>
-            <w:tcW w:type="dxa" w:w="3312"/>
-            <w:vAlign w:val="center"/>
-          </w:tcPr>
-          <w:p>
-            <w:r>
-              <w:t>Gi? h?ng v? s?n ph?m y?u th?ch</w:t>
+              <w:t>Trả text/plain theo từng đoạn để giao diện hiển thị dần.</w:t>
             </w:r>
           </w:p>
         </w:tc>
@@ -2251,7 +583,7 @@
     <w:p/>
     <w:p>
       <w:r>
-        <w:t>ShippingInfo v? PaymentInfo l? c?c l?p @Embeddable trong Order. Script SQL t?o c?c b?ng nghi?p v? v? b?ng product_embedding ?? l?u vector s?n ph?m, c?ng d? li?u m?u cho admin v? customer.</w:t>
+        <w:t>Giới hạn và an toàn: giao diện cũng đặt maxlength=500; streaming tự hủy sau 90 giây, backend đặt timeout Ollama 120 giây. Nội dung chat được dựng an toàn, link /shop/{id} được chuyển thành nút xem sản phẩm. Câu hỏi dài, spam hoặc ngoài chủ đề không làm ứng dụng dừng; hệ thống cắt độ dài, từ chối ngoài phạm vi hoặc dùng fallback.</w:t>
       </w:r>
     </w:p>
     <w:p>
@@ -2259,295 +591,12 @@
         <w:pStyle w:val="Heading1"/>
       </w:pPr>
       <w:r>
-        <w:t>8. Giao di?n v? tr?ng th?i t?nh n?ng</w:t>
-      </w:r>
-    </w:p>
-    <w:p>
-      <w:pPr>
-        <w:pStyle w:val="ListBullet"/>
-      </w:pPr>
-      <w:r>
-        <w:t>layouts/user-base.html v? fragments/user-header.html, user-footer.html d?ng chung cho storefront.</w:t>
-      </w:r>
-    </w:p>
-    <w:p>
-      <w:pPr>
-        <w:pStyle w:val="ListBullet"/>
-      </w:pPr>
-      <w:r>
-        <w:t>layouts/admin-base.html v? fragments/admin-sidebar.html t?o layout qu?n tr?; sidebar c? m?c Th?ng k?.</w:t>
-      </w:r>
-    </w:p>
-    <w:p>
-      <w:pPr>
-        <w:pStyle w:val="ListBullet"/>
-      </w:pPr>
-      <w:r>
-        <w:t>fragments/chatbox.html cung c?p giao di?n chatbot tr?n storefront.</w:t>
-      </w:r>
-    </w:p>
-    <w:p>
-      <w:pPr>
-        <w:pStyle w:val="ListBullet"/>
-      </w:pPr>
-      <w:r>
-        <w:t>user/detail.html hi?n th? ?nh, gi?, khuy?n m?i, SKU, m?u/size, t?n kho, size guide v? s?n ph?m li?n quan.</w:t>
-      </w:r>
-    </w:p>
-    <w:p>
-      <w:pPr>
-        <w:pStyle w:val="ListBullet"/>
-      </w:pPr>
-      <w:r>
-        <w:t>Khi s?n ph?m ho?c bi?n th? h?t h?ng, c?c n?t h?nh ??ng tr?n trang chi ti?t ???c kh?a.</w:t>
-      </w:r>
-    </w:p>
-    <w:p>
-      <w:pPr>
-        <w:pStyle w:val="ListBullet"/>
-      </w:pPr>
-      <w:r>
-        <w:t>C?c m?n h?nh cart, checkout, wishlist v? nhi?u m?n h?nh admin v?n l? khung giao di?n; n?t th?m gi?, mua ngay v? y?u th?ch hi?n m?i m? ph?ng t??ng t?c ph?a tr?nh duy?t, ch?a l?u nghi?p v? qua API.</w:t>
-      </w:r>
-    </w:p>
-    <w:p>
-      <w:pPr>
-        <w:pStyle w:val="ListBullet"/>
-      </w:pPr>
-      <w:r>
-        <w:t>C?c trang l?i 403, 404 v? 500 hi?n th? th?ng b?o t??ng ?ng.</w:t>
-      </w:r>
-    </w:p>
-    <w:p>
-      <w:pPr>
-        <w:pStyle w:val="Heading1"/>
-      </w:pPr>
-      <w:r>
-        <w:t>9. T?m ki?m ng? ngh?a b?ng vector</w:t>
+        <w:t>4. Tìm kiếm vector</w:t>
       </w:r>
     </w:p>
     <w:p>
       <w:r>
-        <w:t>? t?m ki?m tr?n header g?i GET /api/products/search?q=... v? x? l? theo ba t?ng: kh?p t?n th?ng th??ng, kh?p t?n/danh m?c sau khi b? d?u ti?ng Vi?t, sau ?? m?i t?m ng? ngh?a b?ng vector n?u hai t?ng ??u kh?ng c? k?t qu?.</w:t>
-      </w:r>
-    </w:p>
-    <w:tbl>
-      <w:tblPr>
-        <w:tblStyle w:val="TableGrid"/>
-        <w:tblW w:type="auto" w:w="0"/>
-        <w:jc w:val="center"/>
-        <w:tblLook w:firstColumn="1" w:firstRow="1" w:lastColumn="0" w:lastRow="0" w:noHBand="0" w:noVBand="1" w:val="04A0"/>
-      </w:tblPr>
-      <w:tblGrid>
-        <w:gridCol w:w="4968"/>
-        <w:gridCol w:w="4968"/>
-      </w:tblGrid>
-      <w:tr>
-        <w:tc>
-          <w:tcPr>
-            <w:tcW w:type="dxa" w:w="4968"/>
-            <w:shd w:fill="D9EAF7"/>
-          </w:tcPr>
-          <w:p>
-            <w:r>
-              <w:rPr>
-                <w:b/>
-              </w:rPr>
-              <w:t>Th?nh ph?n</w:t>
-            </w:r>
-          </w:p>
-        </w:tc>
-        <w:tc>
-          <w:tcPr>
-            <w:tcW w:type="dxa" w:w="4968"/>
-            <w:shd w:fill="D9EAF7"/>
-          </w:tcPr>
-          <w:p>
-            <w:r>
-              <w:rPr>
-                <w:b/>
-              </w:rPr>
-              <w:t>C?u h?nh</w:t>
-            </w:r>
-          </w:p>
-        </w:tc>
-      </w:tr>
-      <w:tr>
-        <w:tc>
-          <w:tcPr>
-            <w:tcW w:type="dxa" w:w="4968"/>
-            <w:vAlign w:val="center"/>
-          </w:tcPr>
-          <w:p>
-            <w:r>
-              <w:t>B?ng l?u vector</w:t>
-            </w:r>
-          </w:p>
-        </w:tc>
-        <w:tc>
-          <w:tcPr>
-            <w:tcW w:type="dxa" w:w="4968"/>
-            <w:vAlign w:val="center"/>
-          </w:tcPr>
-          <w:p>
-            <w:r>
-              <w:t>product_embedding, li?n k?t v?i product b?ng product_id</w:t>
-            </w:r>
-          </w:p>
-        </w:tc>
-      </w:tr>
-      <w:tr>
-        <w:tc>
-          <w:tcPr>
-            <w:tcW w:type="dxa" w:w="4968"/>
-            <w:vAlign w:val="center"/>
-          </w:tcPr>
-          <w:p>
-            <w:r>
-              <w:t>Ki?u d? li?u</w:t>
-            </w:r>
-          </w:p>
-        </w:tc>
-        <w:tc>
-          <w:tcPr>
-            <w:tcW w:type="dxa" w:w="4968"/>
-            <w:vAlign w:val="center"/>
-          </w:tcPr>
-          <w:p>
-            <w:r>
-              <w:t>VECTOR(1024)</w:t>
-            </w:r>
-          </w:p>
-        </w:tc>
-      </w:tr>
-      <w:tr>
-        <w:tc>
-          <w:tcPr>
-            <w:tcW w:type="dxa" w:w="4968"/>
-            <w:vAlign w:val="center"/>
-          </w:tcPr>
-          <w:p>
-            <w:r>
-              <w:t>Model embedding</w:t>
-            </w:r>
-          </w:p>
-        </w:tc>
-        <w:tc>
-          <w:tcPr>
-            <w:tcW w:type="dxa" w:w="4968"/>
-            <w:vAlign w:val="center"/>
-          </w:tcPr>
-          <w:p>
-            <w:r>
-              <w:t>Ollama bge-m3</w:t>
-            </w:r>
-          </w:p>
-        </w:tc>
-      </w:tr>
-      <w:tr>
-        <w:tc>
-          <w:tcPr>
-            <w:tcW w:type="dxa" w:w="4968"/>
-            <w:vAlign w:val="center"/>
-          </w:tcPr>
-          <w:p>
-            <w:r>
-              <w:t>URL m?c ??nh</w:t>
-            </w:r>
-          </w:p>
-        </w:tc>
-        <w:tc>
-          <w:tcPr>
-            <w:tcW w:type="dxa" w:w="4968"/>
-            <w:vAlign w:val="center"/>
-          </w:tcPr>
-          <w:p>
-            <w:r>
-              <w:t>http://localhost:11434</w:t>
-            </w:r>
-          </w:p>
-        </w:tc>
-      </w:tr>
-      <w:tr>
-        <w:tc>
-          <w:tcPr>
-            <w:tcW w:type="dxa" w:w="4968"/>
-            <w:vAlign w:val="center"/>
-          </w:tcPr>
-          <w:p>
-            <w:r>
-              <w:t>So s?nh</w:t>
-            </w:r>
-          </w:p>
-        </w:tc>
-        <w:tc>
-          <w:tcPr>
-            <w:tcW w:type="dxa" w:w="4968"/>
-            <w:vAlign w:val="center"/>
-          </w:tcPr>
-          <w:p>
-            <w:r>
-              <w:t>MariaDB VEC_DISTANCE_COSINE</w:t>
-            </w:r>
-          </w:p>
-        </w:tc>
-      </w:tr>
-      <w:tr>
-        <w:tc>
-          <w:tcPr>
-            <w:tcW w:type="dxa" w:w="4968"/>
-            <w:vAlign w:val="center"/>
-          </w:tcPr>
-          <w:p>
-            <w:r>
-              <w:t>Ng??ng</w:t>
-            </w:r>
-          </w:p>
-        </w:tc>
-        <w:tc>
-          <w:tcPr>
-            <w:tcW w:type="dxa" w:w="4968"/>
-            <w:vAlign w:val="center"/>
-          </w:tcPr>
-          <w:p>
-            <w:r>
-              <w:t>vector.search.max-distance=1.0</w:t>
-            </w:r>
-          </w:p>
-        </w:tc>
-      </w:tr>
-    </w:tbl>
-    <w:p/>
-    <w:p>
-      <w:pPr>
-        <w:pStyle w:val="ListBullet"/>
-      </w:pPr>
-      <w:r>
-        <w:t>EmbeddingStartupIndexer t?o vector cho s?n ph?m ch?a c? vector khi ?ng d?ng kh?i ??ng n?u Ollama kh? d?ng.</w:t>
-      </w:r>
-    </w:p>
-    <w:p>
-      <w:pPr>
-        <w:pStyle w:val="ListBullet"/>
-      </w:pPr>
-      <w:r>
-        <w:t>Admin c? th? g?i GET /admin/embeddings/rebuild ?? l?p ch? m?c l?i to?n b? s?n ph?m.</w:t>
-      </w:r>
-    </w:p>
-    <w:p>
-      <w:pPr>
-        <w:pStyle w:val="ListBullet"/>
-      </w:pPr>
-      <w:r>
-        <w:t>MariaDB c?n h? tr? ki?u VECTOR; m?i tr??ng theo script y?u c?u t? MariaDB 11.7 tr? l?n.</w:t>
-      </w:r>
-    </w:p>
-    <w:p>
-      <w:pPr>
-        <w:pStyle w:val="ListBullet"/>
-      </w:pPr>
-      <w:r>
-        <w:t>C?n ch?y ollama pull bge-m3. N?u Ollama kh?ng kh? d?ng, t?m ki?m t?n v? kh?ng d?u v?n ho?t ??ng.</w:t>
+        <w:t>API GET /api/products/search?q=... xử lý theo thứ tự: khớp tên thông thường, khớp tên/danh mục không dấu, rồi mới tìm ngữ nghĩa bằng vector tối đa 3 kết quả. Bảng product_embedding lưu VECTOR(1024), so sánh bằng VEC_DISTANCE_COSINE.</w:t>
       </w:r>
     </w:p>
     <w:p>
@@ -2562,7 +611,14 @@
         <w:br/>
         <w:t>ollama.embedding.dimensions=1024</w:t>
         <w:br/>
+        <w:t>ollama.chat.model=qwen2.5:3b</w:t>
+        <w:br/>
         <w:t>vector.search.max-distance=1.0</w:t>
+      </w:r>
+    </w:p>
+    <w:p>
+      <w:r>
+        <w:t>Ollama là dịch vụ chạy cục bộ. Nếu Ollama không sẵn sàng, các tầng tìm kiếm tên và không dấu vẫn hoạt động; chatbot sẽ dùng cơ chế fallback.</w:t>
       </w:r>
     </w:p>
     <w:p>
@@ -2570,7 +626,327 @@
         <w:pStyle w:val="Heading1"/>
       </w:pPr>
       <w:r>
-        <w:t>10. C?i ??t v? ch?y</w:t>
+        <w:t>5. Route và module chính</w:t>
+      </w:r>
+    </w:p>
+    <w:tbl>
+      <w:tblPr>
+        <w:tblStyle w:val="TableGrid"/>
+        <w:tblW w:type="auto" w:w="0"/>
+        <w:tblLook w:firstColumn="1" w:firstRow="1" w:lastColumn="0" w:lastRow="0" w:noHBand="0" w:noVBand="1" w:val="04A0"/>
+      </w:tblPr>
+      <w:tblGrid>
+        <w:gridCol w:w="3360"/>
+        <w:gridCol w:w="3360"/>
+        <w:gridCol w:w="3360"/>
+      </w:tblGrid>
+      <w:tr>
+        <w:tc>
+          <w:tcPr>
+            <w:tcW w:type="dxa" w:w="3360"/>
+            <w:shd w:fill="E5E7EB"/>
+          </w:tcPr>
+          <w:p>
+            <w:r>
+              <w:rPr>
+                <w:rFonts w:ascii="Arial" w:hAnsi="Arial" w:eastAsia="Arial"/>
+                <w:b/>
+                <w:sz w:val="19"/>
+              </w:rPr>
+              <w:t>Nhóm</w:t>
+            </w:r>
+          </w:p>
+        </w:tc>
+        <w:tc>
+          <w:tcPr>
+            <w:tcW w:type="dxa" w:w="3360"/>
+            <w:shd w:fill="E5E7EB"/>
+          </w:tcPr>
+          <w:p>
+            <w:r>
+              <w:rPr>
+                <w:rFonts w:ascii="Arial" w:hAnsi="Arial" w:eastAsia="Arial"/>
+                <w:b/>
+                <w:sz w:val="19"/>
+              </w:rPr>
+              <w:t>Route/thành phần</w:t>
+            </w:r>
+          </w:p>
+        </w:tc>
+        <w:tc>
+          <w:tcPr>
+            <w:tcW w:type="dxa" w:w="3360"/>
+            <w:shd w:fill="E5E7EB"/>
+          </w:tcPr>
+          <w:p>
+            <w:r>
+              <w:rPr>
+                <w:rFonts w:ascii="Arial" w:hAnsi="Arial" w:eastAsia="Arial"/>
+                <w:b/>
+                <w:sz w:val="19"/>
+              </w:rPr>
+              <w:t>Vai trò</w:t>
+            </w:r>
+          </w:p>
+        </w:tc>
+      </w:tr>
+      <w:tr>
+        <w:tc>
+          <w:tcPr>
+            <w:tcW w:type="dxa" w:w="3360"/>
+          </w:tcPr>
+          <w:p>
+            <w:r>
+              <w:rPr>
+                <w:rFonts w:ascii="Arial" w:hAnsi="Arial" w:eastAsia="Arial"/>
+                <w:sz w:val="19"/>
+              </w:rPr>
+              <w:t>Khách hàng</w:t>
+            </w:r>
+          </w:p>
+        </w:tc>
+        <w:tc>
+          <w:tcPr>
+            <w:tcW w:type="dxa" w:w="3360"/>
+          </w:tcPr>
+          <w:p>
+            <w:r>
+              <w:rPr>
+                <w:rFonts w:ascii="Arial" w:hAnsi="Arial" w:eastAsia="Arial"/>
+                <w:sz w:val="19"/>
+              </w:rPr>
+              <w:t>/, /shop, /sale, /cart, /checkout, /orders, /wishlist, /account</w:t>
+            </w:r>
+          </w:p>
+        </w:tc>
+        <w:tc>
+          <w:tcPr>
+            <w:tcW w:type="dxa" w:w="3360"/>
+          </w:tcPr>
+          <w:p>
+            <w:r>
+              <w:rPr>
+                <w:rFonts w:ascii="Arial" w:hAnsi="Arial" w:eastAsia="Arial"/>
+                <w:sz w:val="19"/>
+              </w:rPr>
+              <w:t>Các trang storefront và tài khoản.</w:t>
+            </w:r>
+          </w:p>
+        </w:tc>
+      </w:tr>
+      <w:tr>
+        <w:tc>
+          <w:tcPr>
+            <w:tcW w:type="dxa" w:w="3360"/>
+          </w:tcPr>
+          <w:p>
+            <w:r>
+              <w:rPr>
+                <w:rFonts w:ascii="Arial" w:hAnsi="Arial" w:eastAsia="Arial"/>
+                <w:sz w:val="19"/>
+              </w:rPr>
+              <w:t>Xác thực</w:t>
+            </w:r>
+          </w:p>
+        </w:tc>
+        <w:tc>
+          <w:tcPr>
+            <w:tcW w:type="dxa" w:w="3360"/>
+          </w:tcPr>
+          <w:p>
+            <w:r>
+              <w:t>/login, /register, /register/send-otp, /logout, /terms, /policy, /support</w:t>
+            </w:r>
+          </w:p>
+        </w:tc>
+        <w:tc>
+          <w:tcPr>
+            <w:tcW w:type="dxa" w:w="3360"/>
+          </w:tcPr>
+          <w:p>
+            <w:r>
+              <w:t>Đăng nhập (kiểm tra CSDL), đăng ký xác thực OTP qua email, đăng xuất và trang điều khoản/hỗ trợ.</w:t>
+            </w:r>
+          </w:p>
+        </w:tc>
+      </w:tr>
+      <w:tr>
+        <w:tc>
+          <w:tcPr>
+            <w:tcW w:type="dxa" w:w="3360"/>
+          </w:tcPr>
+          <w:p>
+            <w:r>
+              <w:rPr>
+                <w:rFonts w:ascii="Arial" w:hAnsi="Arial" w:eastAsia="Arial"/>
+                <w:sz w:val="19"/>
+              </w:rPr>
+              <w:t>Quản trị</w:t>
+            </w:r>
+          </w:p>
+        </w:tc>
+        <w:tc>
+          <w:tcPr>
+            <w:tcW w:type="dxa" w:w="3360"/>
+          </w:tcPr>
+          <w:p>
+            <w:r>
+              <w:t>/admin/**, /admin/account</w:t>
+            </w:r>
+          </w:p>
+        </w:tc>
+        <w:tc>
+          <w:tcPr>
+            <w:tcW w:type="dxa" w:w="3360"/>
+          </w:tcPr>
+          <w:p>
+            <w:r>
+              <w:t>Dashboard, danh mục, sản phẩm, kho, đơn hàng, coupon, người dùng, thống kê, tài khoản admin và thiết lập; yêu cầu ROLE_ADMIN.</w:t>
+            </w:r>
+          </w:p>
+        </w:tc>
+      </w:tr>
+      <w:tr>
+        <w:tc>
+          <w:tcPr>
+            <w:tcW w:type="dxa" w:w="3360"/>
+          </w:tcPr>
+          <w:p>
+            <w:r>
+              <w:rPr>
+                <w:rFonts w:ascii="Arial" w:hAnsi="Arial" w:eastAsia="Arial"/>
+                <w:sz w:val="19"/>
+              </w:rPr>
+              <w:t>Chatbot</w:t>
+            </w:r>
+          </w:p>
+        </w:tc>
+        <w:tc>
+          <w:tcPr>
+            <w:tcW w:type="dxa" w:w="3360"/>
+          </w:tcPr>
+          <w:p>
+            <w:r>
+              <w:rPr>
+                <w:rFonts w:ascii="Arial" w:hAnsi="Arial" w:eastAsia="Arial"/>
+                <w:sz w:val="19"/>
+              </w:rPr>
+              <w:t>ChatbotController / ChatbotService</w:t>
+            </w:r>
+          </w:p>
+        </w:tc>
+        <w:tc>
+          <w:tcPr>
+            <w:tcW w:type="dxa" w:w="3360"/>
+          </w:tcPr>
+          <w:p>
+            <w:r>
+              <w:rPr>
+                <w:rFonts w:ascii="Arial" w:hAnsi="Arial" w:eastAsia="Arial"/>
+                <w:sz w:val="19"/>
+              </w:rPr>
+              <w:t>API thường, streaming và logic tư vấn.</w:t>
+            </w:r>
+          </w:p>
+        </w:tc>
+      </w:tr>
+      <w:tr>
+        <w:tc>
+          <w:tcPr>
+            <w:tcW w:type="dxa" w:w="3360"/>
+          </w:tcPr>
+          <w:p>
+            <w:r>
+              <w:rPr>
+                <w:rFonts w:ascii="Arial" w:hAnsi="Arial" w:eastAsia="Arial"/>
+                <w:sz w:val="19"/>
+              </w:rPr>
+              <w:t>Sản phẩm</w:t>
+            </w:r>
+          </w:p>
+        </w:tc>
+        <w:tc>
+          <w:tcPr>
+            <w:tcW w:type="dxa" w:w="3360"/>
+          </w:tcPr>
+          <w:p>
+            <w:r>
+              <w:rPr>
+                <w:rFonts w:ascii="Arial" w:hAnsi="Arial" w:eastAsia="Arial"/>
+                <w:sz w:val="19"/>
+              </w:rPr>
+              <w:t>ProductService / ProductRepository</w:t>
+            </w:r>
+          </w:p>
+        </w:tc>
+        <w:tc>
+          <w:tcPr>
+            <w:tcW w:type="dxa" w:w="3360"/>
+          </w:tcPr>
+          <w:p>
+            <w:r>
+              <w:rPr>
+                <w:rFonts w:ascii="Arial" w:hAnsi="Arial" w:eastAsia="Arial"/>
+                <w:sz w:val="19"/>
+              </w:rPr>
+              <w:t>Chi tiết sản phẩm, giá, biến thể, size, màu và tồn kho.</w:t>
+            </w:r>
+          </w:p>
+        </w:tc>
+      </w:tr>
+      <w:tr>
+        <w:tc>
+          <w:tcPr>
+            <w:tcW w:type="dxa" w:w="3360"/>
+          </w:tcPr>
+          <w:p>
+            <w:r>
+              <w:t>Email &amp; Xác thực</w:t>
+            </w:r>
+          </w:p>
+        </w:tc>
+        <w:tc>
+          <w:tcPr>
+            <w:tcW w:type="dxa" w:w="3360"/>
+          </w:tcPr>
+          <w:p>
+            <w:r>
+              <w:t>EmailService / AccountService</w:t>
+            </w:r>
+          </w:p>
+        </w:tc>
+        <w:tc>
+          <w:tcPr>
+            <w:tcW w:type="dxa" w:w="3360"/>
+          </w:tcPr>
+          <w:p>
+            <w:r>
+              <w:t>Gửi OTP xác thực qua email, xử lý đăng ký và đăng nhập đa phương thức (Email/SĐT).</w:t>
+            </w:r>
+          </w:p>
+        </w:tc>
+      </w:tr>
+    </w:tbl>
+    <w:p/>
+    <w:p>
+      <w:pPr>
+        <w:pStyle w:val="Heading1"/>
+      </w:pPr>
+      <w:r>
+        <w:t>6. Mô hình dữ liệu</w:t>
+      </w:r>
+    </w:p>
+    <w:p>
+      <w:r>
+        <w:t>Các entity chính: Account, UserProfile, ShippingAddress, Category, Product, ProductVariant, ProductImage, Coupon, Order, OrderItem, StockHistory, CartItem và WishlistItem. ShippingInfo và PaymentInfo là các lớp @Embeddable trong Order. Bảng product_embedding phục vụ tìm kiếm vector.</w:t>
+      </w:r>
+    </w:p>
+    <w:p>
+      <w:pPr>
+        <w:pStyle w:val="Heading1"/>
+      </w:pPr>
+      <w:r>
+        <w:t>7. Cài đặt và chạy</w:t>
       </w:r>
     </w:p>
     <w:p>
@@ -2578,7 +954,15 @@
         <w:pStyle w:val="ListBullet"/>
       </w:pPr>
       <w:r>
-        <w:t>C?i Java 21, MariaDB/MySQL v? t?y ch?n Ollama n?u d?ng t?m ki?m vector.</w:t>
+        <w:t>Clone dự án: Kho chứa ở chế độ Private (cần được mời qua GitHub Collaborators):</w:t>
+        <w:br/>
+        <w:t xml:space="preserve">  git clone https://github.com/Hao23651371/fashion-ecommerce-springboot.git</w:t>
+        <w:br/>
+        <w:t xml:space="preserve">  cd fashion-ecommerce-springboot</w:t>
+        <w:br/>
+        <w:t xml:space="preserve">  git checkout develop</w:t>
+        <w:br/>
+        <w:t>Cài đặt JDK 21 và MariaDB &gt;= 11.7 (bắt buộc để hỗ trợ kiểu VECTOR và VEC_DISTANCE_COSINE). Chạy lần lượt 5 script trong thư mục database/ (từ fashion1.sql đến fashion5.sql) để tạo database fashionshop, 14 bảng (gồm product_embedding, product_image) và dữ liệu mẫu.</w:t>
       </w:r>
     </w:p>
     <w:p>
@@ -2586,7 +970,7 @@
         <w:pStyle w:val="ListBullet"/>
       </w:pPr>
       <w:r>
-        <w:t>Ch?y database/fashionshop.sql ?? t?o database fashionshop v? d? li?u m?u.</w:t>
+        <w:t>Cấu hình môi trường (BẮT BUỘC): Sao chép application-local.properties.example thành application-local.properties. Điền mật khẩu database cục bộ (spring.datasource.password) và tài khoản gửi mail OTP (nếu cần test). Chọn chế độ chatbot: chatbot.provider=ollama (chạy cục bộ miễn phí) hoặc chatbot.provider=gemini (điền gemini.api-key và gemini.model tự tạo riêng). Lưu ý: Bảng product_embedding được nạp vector tự động khi app khởi động qua EmbeddingStartupIndexer (hoặc gọi /admin/embeddings/rebuild). Sản phẩm mới thêm vào DB sẽ thấy ngay ở các câu hỏi lọc giá/sale/size; riêng tư vấn AI cần restart app để nạp vector.</w:t>
       </w:r>
     </w:p>
     <w:p>
@@ -2594,15 +978,9 @@
         <w:pStyle w:val="ListBullet"/>
       </w:pPr>
       <w:r>
-        <w:t>Sao ch?p c?u tr?c t? src/main/resources/application-local.properties.example sang application-local.properties r?i ?i?n th?ng tin k?t n?i local.</w:t>
-      </w:r>
-    </w:p>
-    <w:p>
-      <w:pPr>
-        <w:pStyle w:val="ListBullet"/>
-      </w:pPr>
-      <w:r>
-        <w:t>Kh?ng commit application-local.properties ho?c m?t kh?u th?t.</w:t>
+        <w:t>Nếu dùng Ollama: tải phần mềm từ ollama.com, mở terminal chạy: ollama pull bge-m3 (cho vector search) và ollama pull qwen2.5:3b (cho chat).</w:t>
+        <w:br/>
+        <w:t>Quy tắc bảo mật khi push: Tuyệt đối không commit application-local.properties, .env, mật khẩu hay API Key lên GitHub. Giữ repo ở chế độ Private.</w:t>
       </w:r>
     </w:p>
     <w:p>
@@ -2611,19 +989,16 @@
           <w:rFonts w:ascii="Consolas" w:hAnsi="Consolas" w:eastAsia="Consolas"/>
           <w:sz w:val="18"/>
         </w:rPr>
-        <w:t>Windows:</w:t>
+        <w:t>Windows: gradlew.bat bootRun</w:t>
         <w:br/>
-        <w:t xml:space="preserve">  gradlew.bat bootRun</w:t>
+        <w:t>Kiểm thử: gradlew.bat test</w:t>
         <w:br/>
-        <w:br/>
-        <w:t>Linux/macOS:</w:t>
-        <w:br/>
-        <w:t xml:space="preserve">  ./gradlew bootRun</w:t>
+        <w:t>Build: gradlew.bat build</w:t>
       </w:r>
     </w:p>
     <w:p>
       <w:r>
-        <w:t>M? http://localhost:8080/ ho?c http://localhost:8080/login sau khi ?ng d?ng kh?i ??ng.</w:t>
+        <w:t>Mở http://localhost:8080/. Tài khoản mẫu và route chi tiết được mô tả trong README.md.</w:t>
       </w:r>
     </w:p>
     <w:p>
@@ -2631,43 +1006,17 @@
         <w:pStyle w:val="Heading1"/>
       </w:pPr>
       <w:r>
-        <w:t>11. Ki?m th? v? build</w:t>
+        <w:t>8. Kiểm thử và tài liệu liên quan</w:t>
       </w:r>
     </w:p>
     <w:p>
       <w:r>
-        <w:rPr>
-          <w:rFonts w:ascii="Consolas" w:hAnsi="Consolas" w:eastAsia="Consolas"/>
-          <w:sz w:val="18"/>
-        </w:rPr>
-        <w:t>gradlew.bat compileJava</w:t>
-        <w:br/>
-        <w:t>gradlew.bat test</w:t>
-        <w:br/>
-        <w:t>gradlew.bat build</w:t>
-      </w:r>
-    </w:p>
-    <w:p>
-      <w:r>
-        <w:t>Test hi?n c? g?m test kh?i ??ng ?ng d?ng v? ChatbotServiceTest cho c?c tr??ng h?p coupon, s?n ph?m sale, kho?ng gi?, size v? ch?nh s?ch ??i tr?.</w:t>
-      </w:r>
-    </w:p>
-    <w:p>
-      <w:pPr>
-        <w:pStyle w:val="Heading1"/>
-      </w:pPr>
-      <w:r>
-        <w:t>12. T?i li?u li?n quan</w:t>
-      </w:r>
-    </w:p>
-    <w:p>
-      <w:r>
-        <w:t>README.md l? h??ng d?n nhanh v? th?ng tin v?n h?nh trong repository. database/fashionshop.sql l? script schema v? d? li?u m?u. T?i li?u Word n?y l? b?o c?o k? thu?t chi ti?t c?a project.</w:t>
+        <w:t>ChatbotServiceTest kiểm tra coupon, sale theo danh mục, lọc giá, size/tồn kho và chính sách. README.md là hướng dẫn nhanh; thư mục database/ chứa 5 file SQL (fashion1.sql -&gt; fashion5.sql) chuẩn hóa schema và dữ liệu mẫu.</w:t>
       </w:r>
     </w:p>
     <w:sectPr>
       <w:pgSz w:w="12240" w:h="15840"/>
-      <w:pgMar w:top="1008" w:right="1152" w:bottom="1008" w:left="1152" w:header="720" w:footer="720" w:gutter="0"/>
+      <w:pgMar w:top="936" w:right="1080" w:bottom="936" w:left="1080" w:header="720" w:footer="720" w:gutter="0"/>
       <w:cols w:space="720"/>
       <w:docGrid w:linePitch="360"/>
     </w:sectPr>
@@ -3105,8 +1454,8 @@
       <w:rFonts w:asciiTheme="majorHAnsi" w:eastAsiaTheme="majorEastAsia" w:hAnsiTheme="majorHAnsi" w:cstheme="majorBidi" w:ascii="Arial" w:hAnsi="Arial" w:eastAsia="Arial"/>
       <w:b/>
       <w:bCs/>
-      <w:color w:val="365F91" w:themeColor="accent1" w:themeShade="BF"/>
-      <w:sz w:val="28"/>
+      <w:color w:val="1F2937"/>
+      <w:sz w:val="30"/>
       <w:szCs w:val="28"/>
     </w:rPr>
   </w:style>
@@ -3129,8 +1478,8 @@
       <w:rFonts w:asciiTheme="majorHAnsi" w:eastAsiaTheme="majorEastAsia" w:hAnsiTheme="majorHAnsi" w:cstheme="majorBidi" w:ascii="Arial" w:hAnsi="Arial" w:eastAsia="Arial"/>
       <w:b/>
       <w:bCs/>
-      <w:color w:val="4F81BD" w:themeColor="accent1"/>
-      <w:sz w:val="26"/>
+      <w:color w:val="1F2937"/>
+      <w:sz w:val="24"/>
       <w:szCs w:val="26"/>
     </w:rPr>
   </w:style>
@@ -3150,7 +1499,7 @@
       <w:outlineLvl w:val="2"/>
     </w:pPr>
     <w:rPr>
-      <w:rFonts w:asciiTheme="majorHAnsi" w:eastAsiaTheme="majorEastAsia" w:hAnsiTheme="majorHAnsi" w:cstheme="majorBidi" w:ascii="Arial" w:hAnsi="Arial" w:eastAsia="Arial"/>
+      <w:rFonts w:asciiTheme="majorHAnsi" w:eastAsiaTheme="majorEastAsia" w:hAnsiTheme="majorHAnsi" w:cstheme="majorBidi"/>
       <w:b/>
       <w:bCs/>
       <w:color w:val="4F81BD" w:themeColor="accent1"/>
@@ -3392,10 +1741,10 @@
     </w:pPr>
     <w:rPr>
       <w:rFonts w:asciiTheme="majorHAnsi" w:eastAsiaTheme="majorEastAsia" w:hAnsiTheme="majorHAnsi" w:cstheme="majorBidi" w:ascii="Arial" w:hAnsi="Arial" w:eastAsia="Arial"/>
-      <w:color w:val="17365D" w:themeColor="text2" w:themeShade="BF"/>
+      <w:color w:val="1F2937"/>
       <w:spacing w:val="5"/>
       <w:kern w:val="28"/>
-      <w:sz w:val="52"/>
+      <w:sz w:val="40"/>
       <w:szCs w:val="52"/>
     </w:rPr>
   </w:style>

</xml_diff>